<commit_message>
Up to date till sidebar segregation for each user type
</commit_message>
<xml_diff>
--- a/Requirement_Document_KPCB_HRMS.docx
+++ b/Requirement_Document_KPCB_HRMS.docx
@@ -492,19 +492,7 @@
         <w:rPr>
           <w:b/>
         </w:rPr>
-        <w:t>(</w:t>
-      </w:r>
-      <w:r>
-        <w:rPr>
-          <w:b/>
-        </w:rPr>
-        <w:t>Admin will not setup cash counter Duty, During salary Generation, an external procedure will give you the data</w:t>
-      </w:r>
-      <w:r>
-        <w:rPr>
-          <w:b/>
-        </w:rPr>
-        <w:t>)</w:t>
+        <w:t>(Admin will not setup cash counter Duty, During salary Generation, an external procedure will give you the data)</w:t>
       </w:r>
     </w:p>
     <w:p>
@@ -1138,7 +1126,93 @@
         <w:rPr>
           <w:rStyle w:val="Strong"/>
         </w:rPr>
-        <w:t>Designation-Based Rates:</w:t>
+        <w:t>Designation-Based Rates</w:t>
+      </w:r>
+      <w:r>
+        <w:rPr>
+          <w:rStyle w:val="Strong"/>
+        </w:rPr>
+        <w:t xml:space="preserve"> (Revamped</w:t>
+      </w:r>
+      <w:proofErr w:type="gramStart"/>
+      <w:r>
+        <w:rPr>
+          <w:rStyle w:val="Strong"/>
+        </w:rPr>
+        <w:t xml:space="preserve">) </w:t>
+      </w:r>
+      <w:r>
+        <w:rPr>
+          <w:rStyle w:val="Strong"/>
+        </w:rPr>
+        <w:t>:</w:t>
+      </w:r>
+      <w:proofErr w:type="gramEnd"/>
+      <w:r>
+        <w:rPr>
+          <w:rStyle w:val="Strong"/>
+        </w:rPr>
+        <w:t xml:space="preserve">  </w:t>
+      </w:r>
+      <w:r>
+        <w:rPr>
+          <w:rStyle w:val="Strong"/>
+          <w:b w:val="0"/>
+        </w:rPr>
+        <w:t>(</w:t>
+      </w:r>
+      <w:r>
+        <w:rPr>
+          <w:rFonts w:ascii="Calibri" w:hAnsi="Calibri" w:cs="Calibri"/>
+          <w:b/>
+          <w:sz w:val="22"/>
+          <w:szCs w:val="22"/>
+        </w:rPr>
+        <w:t xml:space="preserve">Needs to be fully flexible &amp; Allowance dynamic in nature </w:t>
+      </w:r>
+      <w:r>
+        <w:rPr>
+          <w:rFonts w:ascii="Calibri" w:hAnsi="Calibri" w:cs="Calibri"/>
+          <w:b/>
+          <w:sz w:val="22"/>
+          <w:szCs w:val="22"/>
+        </w:rPr>
+        <w:t xml:space="preserve">so that </w:t>
+      </w:r>
+      <w:r>
+        <w:rPr>
+          <w:rFonts w:ascii="Calibri" w:hAnsi="Calibri" w:cs="Calibri"/>
+          <w:b/>
+          <w:sz w:val="22"/>
+          <w:szCs w:val="22"/>
+        </w:rPr>
+        <w:t>Admin can be able to edit this</w:t>
+      </w:r>
+      <w:r>
+        <w:rPr>
+          <w:rFonts w:ascii="Calibri" w:hAnsi="Calibri" w:cs="Calibri"/>
+          <w:b/>
+          <w:sz w:val="22"/>
+          <w:szCs w:val="22"/>
+        </w:rPr>
+        <w:t xml:space="preserve">. </w:t>
+      </w:r>
+      <w:r>
+        <w:rPr>
+          <w:rFonts w:ascii="Calibri" w:hAnsi="Calibri" w:cs="Calibri"/>
+          <w:b/>
+          <w:sz w:val="22"/>
+          <w:szCs w:val="22"/>
+        </w:rPr>
+        <w:t xml:space="preserve"> )</w:t>
+      </w:r>
+      <w:r>
+        <w:rPr>
+          <w:rFonts w:ascii="Calibri" w:hAnsi="Calibri" w:cs="Calibri"/>
+          <w:sz w:val="22"/>
+          <w:szCs w:val="22"/>
+        </w:rPr>
+        <w:t xml:space="preserve"> </w:t>
       </w:r>
     </w:p>
     <w:p>
@@ -1404,231 +1478,1635 @@
         <w:t>Reimbursements:</w:t>
       </w:r>
       <w:r>
-        <w:t xml:space="preserve"> Portal for emplo</w:t>
+        <w:t xml:space="preserve"> Portal for employees to digitally claim travel or medical expenses with multi-level routing.</w:t>
+      </w:r>
+    </w:p>
+    <w:p>
+      <w:pPr>
+        <w:pStyle w:val="Heading3"/>
+      </w:pPr>
+      <w:r>
+        <w:t xml:space="preserve">2.8. </w:t>
+      </w:r>
+      <w:proofErr w:type="spellStart"/>
+      <w:r>
+        <w:t>Offboarding</w:t>
+      </w:r>
+      <w:proofErr w:type="spellEnd"/>
+      <w:r>
+        <w:t xml:space="preserve"> &amp; Exit Management (Future Scope &amp; Further Discussions)</w:t>
+      </w:r>
+    </w:p>
+    <w:p>
+      <w:pPr>
+        <w:pStyle w:val="NormalWeb"/>
+        <w:numPr>
+          <w:ilvl w:val="0"/>
+          <w:numId w:val="21"/>
+        </w:numPr>
+      </w:pPr>
+      <w:r>
+        <w:rPr>
+          <w:rStyle w:val="Strong"/>
+        </w:rPr>
+        <w:t>Exit Workflows:</w:t>
+      </w:r>
+      <w:r>
+        <w:t xml:space="preserve"> Resignation portal, automated IT/Admin clearance tasks, and Full &amp; Final (F&amp;F) settlement calculations.</w:t>
+      </w:r>
+    </w:p>
+    <w:p>
+      <w:pPr>
+        <w:pStyle w:val="Heading3"/>
+      </w:pPr>
+      <w:r>
+        <w:t>2.9. Employee Self-Service (ESS)</w:t>
+      </w:r>
+    </w:p>
+    <w:p>
+      <w:pPr>
+        <w:pStyle w:val="NormalWeb"/>
+        <w:numPr>
+          <w:ilvl w:val="0"/>
+          <w:numId w:val="22"/>
+        </w:numPr>
+      </w:pPr>
+      <w:r>
+        <w:rPr>
+          <w:rStyle w:val="Strong"/>
+        </w:rPr>
+        <w:t>Personal Dashboard:</w:t>
+      </w:r>
+      <w:r>
+        <w:t xml:space="preserve"> View biometric attendance logs, leave balances, </w:t>
+      </w:r>
+      <w:proofErr w:type="spellStart"/>
+      <w:r>
+        <w:t>payslips</w:t>
+      </w:r>
+      <w:proofErr w:type="spellEnd"/>
+      <w:r>
+        <w:t>, and apply for leaves.</w:t>
+      </w:r>
+    </w:p>
+    <w:p>
+      <w:pPr>
+        <w:pStyle w:val="Heading3"/>
+      </w:pPr>
+      <w:r>
+        <w:t>2.10. Employee Loans &amp; Advances (Future Scope &amp; Further Discussions)</w:t>
+      </w:r>
+    </w:p>
+    <w:p>
+      <w:pPr>
+        <w:pStyle w:val="NormalWeb"/>
+        <w:numPr>
+          <w:ilvl w:val="0"/>
+          <w:numId w:val="23"/>
+        </w:numPr>
+      </w:pPr>
+      <w:r>
+        <w:rPr>
+          <w:rStyle w:val="Strong"/>
+        </w:rPr>
+        <w:t>Sofia Integration:</w:t>
+      </w:r>
+      <w:r>
+        <w:t xml:space="preserve"> The HRMS will integrate with the bank's external core banking software, </w:t>
+      </w:r>
+      <w:r>
+        <w:rPr>
+          <w:rStyle w:val="Strong"/>
+        </w:rPr>
+        <w:t>"Sofia"</w:t>
+      </w:r>
+      <w:r>
+        <w:t>, via secure APIs or scheduled file drops.</w:t>
+      </w:r>
+    </w:p>
+    <w:p>
+      <w:pPr>
+        <w:pStyle w:val="NormalWeb"/>
+        <w:numPr>
+          <w:ilvl w:val="0"/>
+          <w:numId w:val="23"/>
+        </w:numPr>
+      </w:pPr>
+      <w:r>
+        <w:rPr>
+          <w:rStyle w:val="Strong"/>
+        </w:rPr>
+        <w:t>Data Sync:</w:t>
+      </w:r>
+      <w:r>
+        <w:t xml:space="preserve"> The system will receive automated data feeds containing active employee loan details and EMI schedules.</w:t>
+      </w:r>
+    </w:p>
+    <w:p>
+      <w:pPr>
+        <w:pStyle w:val="NormalWeb"/>
+        <w:numPr>
+          <w:ilvl w:val="0"/>
+          <w:numId w:val="23"/>
+        </w:numPr>
+      </w:pPr>
+      <w:r>
+        <w:rPr>
+          <w:rStyle w:val="Strong"/>
+        </w:rPr>
+        <w:t>Payroll Processing:</w:t>
+      </w:r>
+      <w:r>
+        <w:t xml:space="preserve"> Synchronized loan EMI amounts will be automatically treated as deductions during the monthly payroll run.</w:t>
+      </w:r>
+    </w:p>
+    <w:p>
+      <w:pPr>
+        <w:pStyle w:val="Heading2"/>
+      </w:pPr>
+      <w:r>
+        <w:t xml:space="preserve">3. </w:t>
+      </w:r>
+      <w:r>
+        <w:t xml:space="preserve">User Roles &amp; Access Control (Role-Based Access Control - RBAC) REVAMPED </w:t>
+      </w:r>
+    </w:p>
+    <w:p>
+      <w:pPr>
+        <w:pStyle w:val="Heading2"/>
+        <w:rPr>
+          <w:sz w:val="24"/>
+          <w:szCs w:val="24"/>
+        </w:rPr>
+      </w:pPr>
+      <w:r>
+        <w:rPr>
+          <w:sz w:val="24"/>
+          <w:szCs w:val="24"/>
+        </w:rPr>
+        <w:t>The application will use a Role-Based Access Control (RBAC) system. Access to modules and features will be controlled based on the User Type assigned to an employee.</w:t>
+      </w:r>
+    </w:p>
+    <w:p>
+      <w:pPr>
+        <w:pStyle w:val="Heading2"/>
+        <w:rPr>
+          <w:sz w:val="24"/>
+          <w:szCs w:val="24"/>
+        </w:rPr>
+      </w:pPr>
+      <w:r>
+        <w:rPr>
+          <w:sz w:val="24"/>
+          <w:szCs w:val="24"/>
+        </w:rPr>
+        <w:t>User Types in the Application</w:t>
+      </w:r>
+    </w:p>
+    <w:p>
+      <w:pPr>
+        <w:pStyle w:val="Heading2"/>
+        <w:rPr>
+          <w:sz w:val="24"/>
+          <w:szCs w:val="24"/>
+        </w:rPr>
+      </w:pPr>
+      <w:r>
+        <w:rPr>
+          <w:sz w:val="24"/>
+          <w:szCs w:val="24"/>
+        </w:rPr>
+        <w:t>1. Admin</w:t>
+      </w:r>
+    </w:p>
+    <w:p>
+      <w:pPr>
+        <w:pStyle w:val="Heading2"/>
+        <w:numPr>
+          <w:ilvl w:val="0"/>
+          <w:numId w:val="28"/>
+        </w:numPr>
+        <w:rPr>
+          <w:b w:val="0"/>
+          <w:sz w:val="24"/>
+          <w:szCs w:val="24"/>
+        </w:rPr>
+      </w:pPr>
+      <w:r>
+        <w:rPr>
+          <w:b w:val="0"/>
+          <w:sz w:val="24"/>
+          <w:szCs w:val="24"/>
+        </w:rPr>
+        <w:t xml:space="preserve">Full access to the entire application. </w:t>
+      </w:r>
+    </w:p>
+    <w:p>
+      <w:pPr>
+        <w:pStyle w:val="Heading2"/>
+        <w:numPr>
+          <w:ilvl w:val="0"/>
+          <w:numId w:val="28"/>
+        </w:numPr>
+        <w:rPr>
+          <w:b w:val="0"/>
+          <w:sz w:val="24"/>
+          <w:szCs w:val="24"/>
+        </w:rPr>
+      </w:pPr>
+      <w:r>
+        <w:rPr>
+          <w:b w:val="0"/>
+          <w:sz w:val="24"/>
+          <w:szCs w:val="24"/>
+        </w:rPr>
+        <w:t xml:space="preserve">Can access the following modules: </w:t>
+      </w:r>
+    </w:p>
+    <w:p>
+      <w:pPr>
+        <w:pStyle w:val="Heading2"/>
+        <w:numPr>
+          <w:ilvl w:val="1"/>
+          <w:numId w:val="28"/>
+        </w:numPr>
+        <w:rPr>
+          <w:b w:val="0"/>
+          <w:sz w:val="24"/>
+          <w:szCs w:val="24"/>
+        </w:rPr>
+      </w:pPr>
+      <w:r>
+        <w:rPr>
+          <w:b w:val="0"/>
+          <w:sz w:val="24"/>
+          <w:szCs w:val="24"/>
+        </w:rPr>
+        <w:t xml:space="preserve">Dashboard </w:t>
+      </w:r>
+    </w:p>
+    <w:p>
+      <w:pPr>
+        <w:pStyle w:val="Heading2"/>
+        <w:numPr>
+          <w:ilvl w:val="1"/>
+          <w:numId w:val="28"/>
+        </w:numPr>
+        <w:rPr>
+          <w:b w:val="0"/>
+          <w:sz w:val="24"/>
+          <w:szCs w:val="24"/>
+        </w:rPr>
+      </w:pPr>
+      <w:r>
+        <w:rPr>
+          <w:b w:val="0"/>
+          <w:sz w:val="24"/>
+          <w:szCs w:val="24"/>
+        </w:rPr>
+        <w:t xml:space="preserve">Leave Apply </w:t>
+      </w:r>
+    </w:p>
+    <w:p>
+      <w:pPr>
+        <w:pStyle w:val="Heading2"/>
+        <w:numPr>
+          <w:ilvl w:val="1"/>
+          <w:numId w:val="28"/>
+        </w:numPr>
+        <w:rPr>
+          <w:b w:val="0"/>
+          <w:sz w:val="24"/>
+          <w:szCs w:val="24"/>
+        </w:rPr>
+      </w:pPr>
+      <w:r>
+        <w:rPr>
+          <w:b w:val="0"/>
+          <w:sz w:val="24"/>
+          <w:szCs w:val="24"/>
+        </w:rPr>
+        <w:t xml:space="preserve">Leave Approval </w:t>
+      </w:r>
+    </w:p>
+    <w:p>
+      <w:pPr>
+        <w:pStyle w:val="Heading2"/>
+        <w:numPr>
+          <w:ilvl w:val="1"/>
+          <w:numId w:val="28"/>
+        </w:numPr>
+        <w:rPr>
+          <w:b w:val="0"/>
+          <w:sz w:val="24"/>
+          <w:szCs w:val="24"/>
+        </w:rPr>
+      </w:pPr>
+      <w:r>
+        <w:rPr>
+          <w:b w:val="0"/>
+          <w:sz w:val="24"/>
+          <w:szCs w:val="24"/>
+        </w:rPr>
+        <w:t xml:space="preserve">Employee Directory </w:t>
+      </w:r>
+    </w:p>
+    <w:p>
+      <w:pPr>
+        <w:pStyle w:val="Heading2"/>
+        <w:numPr>
+          <w:ilvl w:val="1"/>
+          <w:numId w:val="28"/>
+        </w:numPr>
+        <w:rPr>
+          <w:b w:val="0"/>
+          <w:sz w:val="24"/>
+          <w:szCs w:val="24"/>
+        </w:rPr>
+      </w:pPr>
+      <w:r>
+        <w:rPr>
+          <w:b w:val="0"/>
+          <w:sz w:val="24"/>
+          <w:szCs w:val="24"/>
+        </w:rPr>
+        <w:t xml:space="preserve">Attendance </w:t>
+      </w:r>
+    </w:p>
+    <w:p>
+      <w:pPr>
+        <w:pStyle w:val="Heading2"/>
+        <w:numPr>
+          <w:ilvl w:val="1"/>
+          <w:numId w:val="28"/>
+        </w:numPr>
+        <w:rPr>
+          <w:b w:val="0"/>
+          <w:sz w:val="24"/>
+          <w:szCs w:val="24"/>
+        </w:rPr>
+      </w:pPr>
+      <w:r>
+        <w:rPr>
+          <w:b w:val="0"/>
+          <w:sz w:val="24"/>
+          <w:szCs w:val="24"/>
+        </w:rPr>
+        <w:t xml:space="preserve">Payroll </w:t>
+      </w:r>
+    </w:p>
+    <w:p>
+      <w:pPr>
+        <w:pStyle w:val="Heading2"/>
+        <w:numPr>
+          <w:ilvl w:val="1"/>
+          <w:numId w:val="28"/>
+        </w:numPr>
+        <w:rPr>
+          <w:b w:val="0"/>
+          <w:sz w:val="24"/>
+          <w:szCs w:val="24"/>
+        </w:rPr>
+      </w:pPr>
+      <w:r>
+        <w:rPr>
+          <w:b w:val="0"/>
+          <w:sz w:val="24"/>
+          <w:szCs w:val="24"/>
+        </w:rPr>
+        <w:t xml:space="preserve">Branch Directory </w:t>
+      </w:r>
+    </w:p>
+    <w:p>
+      <w:pPr>
+        <w:pStyle w:val="Heading2"/>
+        <w:numPr>
+          <w:ilvl w:val="1"/>
+          <w:numId w:val="28"/>
+        </w:numPr>
+        <w:rPr>
+          <w:b w:val="0"/>
+          <w:sz w:val="24"/>
+          <w:szCs w:val="24"/>
+        </w:rPr>
+      </w:pPr>
+      <w:r>
+        <w:rPr>
+          <w:b w:val="0"/>
+          <w:sz w:val="24"/>
+          <w:szCs w:val="24"/>
+        </w:rPr>
+        <w:t xml:space="preserve">Holiday Calendar </w:t>
+      </w:r>
+    </w:p>
+    <w:p>
+      <w:pPr>
+        <w:pStyle w:val="Heading2"/>
+        <w:numPr>
+          <w:ilvl w:val="0"/>
+          <w:numId w:val="28"/>
+        </w:numPr>
+        <w:rPr>
+          <w:b w:val="0"/>
+          <w:sz w:val="24"/>
+          <w:szCs w:val="24"/>
+        </w:rPr>
+      </w:pPr>
+      <w:r>
+        <w:rPr>
+          <w:b w:val="0"/>
+          <w:sz w:val="24"/>
+          <w:szCs w:val="24"/>
+        </w:rPr>
+        <w:t xml:space="preserve">Can create, modify, assign, and remove user roles. </w:t>
+      </w:r>
+    </w:p>
+    <w:p>
+      <w:pPr>
+        <w:pStyle w:val="Heading2"/>
+        <w:numPr>
+          <w:ilvl w:val="0"/>
+          <w:numId w:val="28"/>
+        </w:numPr>
+        <w:rPr>
+          <w:b w:val="0"/>
+          <w:sz w:val="24"/>
+          <w:szCs w:val="24"/>
+        </w:rPr>
+      </w:pPr>
+      <w:r>
+        <w:rPr>
+          <w:b w:val="0"/>
+          <w:sz w:val="24"/>
+          <w:szCs w:val="24"/>
+        </w:rPr>
+        <w:t xml:space="preserve">Can manage all employee records, payroll data, attendance data, and system configurations. </w:t>
+      </w:r>
+    </w:p>
+    <w:p>
+      <w:pPr>
+        <w:pStyle w:val="Heading2"/>
+        <w:rPr>
+          <w:sz w:val="24"/>
+          <w:szCs w:val="24"/>
+        </w:rPr>
+      </w:pPr>
+      <w:r>
+        <w:rPr>
+          <w:sz w:val="24"/>
+          <w:szCs w:val="24"/>
+        </w:rPr>
+        <w:lastRenderedPageBreak/>
+        <w:t>2. Payroll User</w:t>
+      </w:r>
+    </w:p>
+    <w:p>
+      <w:pPr>
+        <w:pStyle w:val="Heading2"/>
+        <w:numPr>
+          <w:ilvl w:val="0"/>
+          <w:numId w:val="29"/>
+        </w:numPr>
+        <w:rPr>
+          <w:b w:val="0"/>
+          <w:sz w:val="24"/>
+          <w:szCs w:val="24"/>
+        </w:rPr>
+      </w:pPr>
+      <w:r>
+        <w:rPr>
+          <w:b w:val="0"/>
+          <w:sz w:val="24"/>
+          <w:szCs w:val="24"/>
+        </w:rPr>
+        <w:t xml:space="preserve">Can access: </w:t>
+      </w:r>
+    </w:p>
+    <w:p>
+      <w:pPr>
+        <w:pStyle w:val="Heading2"/>
+        <w:numPr>
+          <w:ilvl w:val="1"/>
+          <w:numId w:val="29"/>
+        </w:numPr>
+        <w:rPr>
+          <w:b w:val="0"/>
+          <w:sz w:val="24"/>
+          <w:szCs w:val="24"/>
+        </w:rPr>
+      </w:pPr>
+      <w:r>
+        <w:rPr>
+          <w:b w:val="0"/>
+          <w:sz w:val="24"/>
+          <w:szCs w:val="24"/>
+        </w:rPr>
+        <w:t xml:space="preserve">Leave Apply </w:t>
+      </w:r>
+    </w:p>
+    <w:p>
+      <w:pPr>
+        <w:pStyle w:val="Heading2"/>
+        <w:numPr>
+          <w:ilvl w:val="1"/>
+          <w:numId w:val="29"/>
+        </w:numPr>
+        <w:rPr>
+          <w:b w:val="0"/>
+          <w:sz w:val="24"/>
+          <w:szCs w:val="24"/>
+        </w:rPr>
+      </w:pPr>
+      <w:r>
+        <w:rPr>
+          <w:b w:val="0"/>
+          <w:sz w:val="24"/>
+          <w:szCs w:val="24"/>
+        </w:rPr>
+        <w:t xml:space="preserve">Leave Approval </w:t>
+      </w:r>
+    </w:p>
+    <w:p>
+      <w:pPr>
+        <w:pStyle w:val="Heading2"/>
+        <w:numPr>
+          <w:ilvl w:val="1"/>
+          <w:numId w:val="29"/>
+        </w:numPr>
+        <w:rPr>
+          <w:b w:val="0"/>
+          <w:sz w:val="24"/>
+          <w:szCs w:val="24"/>
+        </w:rPr>
+      </w:pPr>
+      <w:r>
+        <w:rPr>
+          <w:b w:val="0"/>
+          <w:sz w:val="24"/>
+          <w:szCs w:val="24"/>
+        </w:rPr>
+        <w:t xml:space="preserve">Attendance </w:t>
+      </w:r>
+    </w:p>
+    <w:p>
+      <w:pPr>
+        <w:pStyle w:val="Heading2"/>
+        <w:numPr>
+          <w:ilvl w:val="1"/>
+          <w:numId w:val="29"/>
+        </w:numPr>
+        <w:rPr>
+          <w:b w:val="0"/>
+          <w:sz w:val="24"/>
+          <w:szCs w:val="24"/>
+        </w:rPr>
+      </w:pPr>
+      <w:r>
+        <w:rPr>
+          <w:b w:val="0"/>
+          <w:sz w:val="24"/>
+          <w:szCs w:val="24"/>
+        </w:rPr>
+        <w:t xml:space="preserve">Payroll </w:t>
+      </w:r>
+    </w:p>
+    <w:p>
+      <w:pPr>
+        <w:pStyle w:val="Heading2"/>
+        <w:numPr>
+          <w:ilvl w:val="0"/>
+          <w:numId w:val="29"/>
+        </w:numPr>
+        <w:rPr>
+          <w:b w:val="0"/>
+          <w:sz w:val="24"/>
+          <w:szCs w:val="24"/>
+        </w:rPr>
+      </w:pPr>
+      <w:r>
+        <w:rPr>
+          <w:b w:val="0"/>
+          <w:sz w:val="24"/>
+          <w:szCs w:val="24"/>
+        </w:rPr>
+        <w:t xml:space="preserve">Can perform payroll-related activities as permitted by the Admin. </w:t>
+      </w:r>
+    </w:p>
+    <w:p>
+      <w:pPr>
+        <w:pStyle w:val="Heading2"/>
+        <w:rPr>
+          <w:sz w:val="24"/>
+          <w:szCs w:val="24"/>
+        </w:rPr>
+      </w:pPr>
+      <w:r>
+        <w:rPr>
+          <w:sz w:val="24"/>
+          <w:szCs w:val="24"/>
+        </w:rPr>
+        <w:t>3. Attendance User</w:t>
+      </w:r>
+    </w:p>
+    <w:p>
+      <w:pPr>
+        <w:pStyle w:val="Heading2"/>
+        <w:numPr>
+          <w:ilvl w:val="0"/>
+          <w:numId w:val="30"/>
+        </w:numPr>
+        <w:rPr>
+          <w:b w:val="0"/>
+          <w:sz w:val="24"/>
+          <w:szCs w:val="24"/>
+        </w:rPr>
+      </w:pPr>
+      <w:r>
+        <w:rPr>
+          <w:b w:val="0"/>
+          <w:sz w:val="24"/>
+          <w:szCs w:val="24"/>
+        </w:rPr>
+        <w:t xml:space="preserve">Can access: </w:t>
+      </w:r>
+    </w:p>
+    <w:p>
+      <w:pPr>
+        <w:pStyle w:val="Heading2"/>
+        <w:numPr>
+          <w:ilvl w:val="1"/>
+          <w:numId w:val="30"/>
+        </w:numPr>
+        <w:rPr>
+          <w:b w:val="0"/>
+          <w:sz w:val="24"/>
+          <w:szCs w:val="24"/>
+        </w:rPr>
+      </w:pPr>
+      <w:r>
+        <w:rPr>
+          <w:b w:val="0"/>
+          <w:sz w:val="24"/>
+          <w:szCs w:val="24"/>
+        </w:rPr>
+        <w:t xml:space="preserve">Leave Apply </w:t>
+      </w:r>
+    </w:p>
+    <w:p>
+      <w:pPr>
+        <w:pStyle w:val="Heading2"/>
+        <w:numPr>
+          <w:ilvl w:val="1"/>
+          <w:numId w:val="30"/>
+        </w:numPr>
+        <w:rPr>
+          <w:b w:val="0"/>
+          <w:sz w:val="24"/>
+          <w:szCs w:val="24"/>
+        </w:rPr>
+      </w:pPr>
+      <w:r>
+        <w:rPr>
+          <w:b w:val="0"/>
+          <w:sz w:val="24"/>
+          <w:szCs w:val="24"/>
+        </w:rPr>
+        <w:t xml:space="preserve">Leave Approval </w:t>
+      </w:r>
+    </w:p>
+    <w:p>
+      <w:pPr>
+        <w:pStyle w:val="Heading2"/>
+        <w:numPr>
+          <w:ilvl w:val="1"/>
+          <w:numId w:val="30"/>
+        </w:numPr>
+        <w:rPr>
+          <w:b w:val="0"/>
+          <w:sz w:val="24"/>
+          <w:szCs w:val="24"/>
+        </w:rPr>
+      </w:pPr>
+      <w:r>
+        <w:rPr>
+          <w:b w:val="0"/>
+          <w:sz w:val="24"/>
+          <w:szCs w:val="24"/>
+        </w:rPr>
+        <w:t xml:space="preserve">Attendance </w:t>
+      </w:r>
+    </w:p>
+    <w:p>
+      <w:pPr>
+        <w:pStyle w:val="Heading2"/>
+        <w:numPr>
+          <w:ilvl w:val="0"/>
+          <w:numId w:val="30"/>
+        </w:numPr>
+        <w:rPr>
+          <w:b w:val="0"/>
+          <w:sz w:val="24"/>
+          <w:szCs w:val="24"/>
+        </w:rPr>
+      </w:pPr>
+      <w:r>
+        <w:rPr>
+          <w:b w:val="0"/>
+          <w:sz w:val="24"/>
+          <w:szCs w:val="24"/>
+        </w:rPr>
+        <w:t xml:space="preserve">Can manage attendance-related activities as permitted by the Admin. </w:t>
+      </w:r>
+    </w:p>
+    <w:p>
+      <w:pPr>
+        <w:pStyle w:val="Heading2"/>
+        <w:rPr>
+          <w:sz w:val="24"/>
+          <w:szCs w:val="24"/>
+        </w:rPr>
+      </w:pPr>
+      <w:r>
+        <w:rPr>
+          <w:sz w:val="24"/>
+          <w:szCs w:val="24"/>
+        </w:rPr>
+        <w:t>4. User</w:t>
+      </w:r>
+    </w:p>
+    <w:p>
+      <w:pPr>
+        <w:pStyle w:val="Heading2"/>
+        <w:numPr>
+          <w:ilvl w:val="0"/>
+          <w:numId w:val="31"/>
+        </w:numPr>
+        <w:rPr>
+          <w:b w:val="0"/>
+          <w:sz w:val="24"/>
+          <w:szCs w:val="24"/>
+        </w:rPr>
+      </w:pPr>
+      <w:r>
+        <w:rPr>
+          <w:b w:val="0"/>
+          <w:sz w:val="24"/>
+          <w:szCs w:val="24"/>
+        </w:rPr>
+        <w:t xml:space="preserve">Can access: </w:t>
+      </w:r>
+    </w:p>
+    <w:p>
+      <w:pPr>
+        <w:pStyle w:val="Heading2"/>
+        <w:numPr>
+          <w:ilvl w:val="1"/>
+          <w:numId w:val="31"/>
+        </w:numPr>
+        <w:rPr>
+          <w:b w:val="0"/>
+          <w:sz w:val="24"/>
+          <w:szCs w:val="24"/>
+        </w:rPr>
+      </w:pPr>
+      <w:r>
+        <w:rPr>
+          <w:b w:val="0"/>
+          <w:sz w:val="24"/>
+          <w:szCs w:val="24"/>
+        </w:rPr>
+        <w:t xml:space="preserve">Leave Apply </w:t>
+      </w:r>
+    </w:p>
+    <w:p>
+      <w:pPr>
+        <w:pStyle w:val="Heading2"/>
+        <w:numPr>
+          <w:ilvl w:val="1"/>
+          <w:numId w:val="31"/>
+        </w:numPr>
+        <w:rPr>
+          <w:b w:val="0"/>
+          <w:sz w:val="24"/>
+          <w:szCs w:val="24"/>
+        </w:rPr>
+      </w:pPr>
+      <w:r>
+        <w:rPr>
+          <w:b w:val="0"/>
+          <w:sz w:val="24"/>
+          <w:szCs w:val="24"/>
+        </w:rPr>
+        <w:t xml:space="preserve">Leave Approval </w:t>
+      </w:r>
+    </w:p>
+    <w:p>
+      <w:pPr>
+        <w:pStyle w:val="Heading2"/>
+        <w:numPr>
+          <w:ilvl w:val="0"/>
+          <w:numId w:val="31"/>
+        </w:numPr>
+        <w:rPr>
+          <w:b w:val="0"/>
+          <w:sz w:val="24"/>
+          <w:szCs w:val="24"/>
+        </w:rPr>
+      </w:pPr>
+      <w:r>
+        <w:rPr>
+          <w:b w:val="0"/>
+          <w:sz w:val="24"/>
+          <w:szCs w:val="24"/>
+        </w:rPr>
+        <w:t xml:space="preserve">Can only perform activities allowed for regular employees. </w:t>
+      </w:r>
+    </w:p>
+    <w:p>
+      <w:pPr>
+        <w:pStyle w:val="Heading2"/>
+        <w:rPr>
+          <w:sz w:val="24"/>
+          <w:szCs w:val="24"/>
+        </w:rPr>
+      </w:pPr>
+      <w:r>
+        <w:rPr>
+          <w:sz w:val="24"/>
+          <w:szCs w:val="24"/>
+        </w:rPr>
+        <w:pict>
+          <v:rect id="_x0000_i1025" style="width:0;height:1.5pt" o:hralign="center" o:hrstd="t" o:hr="t" fillcolor="#a0a0a0" stroked="f"/>
+        </w:pict>
+      </w:r>
+    </w:p>
+    <w:p>
+      <w:pPr>
+        <w:pStyle w:val="Heading2"/>
+        <w:rPr>
+          <w:u w:val="single"/>
+        </w:rPr>
+      </w:pPr>
+      <w:r>
+        <w:rPr>
+          <w:u w:val="single"/>
+        </w:rPr>
+        <w:t>Designation Structure</w:t>
+      </w:r>
+      <w:r>
+        <w:rPr>
+          <w:u w:val="single"/>
+        </w:rPr>
+        <w:t xml:space="preserve"> within app &amp; bank</w:t>
+      </w:r>
+    </w:p>
+    <w:p>
+      <w:pPr>
+        <w:pStyle w:val="Heading2"/>
+        <w:rPr>
+          <w:sz w:val="24"/>
+          <w:szCs w:val="24"/>
+        </w:rPr>
+      </w:pPr>
+      <w:r>
+        <w:rPr>
+          <w:sz w:val="24"/>
+          <w:szCs w:val="24"/>
+        </w:rPr>
+        <w:t>The application will maintain two separate designation types:</w:t>
+      </w:r>
+    </w:p>
+    <w:p>
+      <w:pPr>
+        <w:pStyle w:val="Heading2"/>
+        <w:rPr>
+          <w:sz w:val="24"/>
+          <w:szCs w:val="24"/>
+        </w:rPr>
+      </w:pPr>
+      <w:r>
+        <w:rPr>
+          <w:sz w:val="24"/>
+          <w:szCs w:val="24"/>
+        </w:rPr>
+        <w:t>1. Bank Designation</w:t>
+      </w:r>
+    </w:p>
+    <w:p>
+      <w:pPr>
+        <w:pStyle w:val="Heading2"/>
+        <w:rPr>
+          <w:sz w:val="24"/>
+          <w:szCs w:val="24"/>
+        </w:rPr>
+      </w:pPr>
+      <w:r>
+        <w:rPr>
+          <w:sz w:val="24"/>
+          <w:szCs w:val="24"/>
+        </w:rPr>
+        <w:t>This represents the employee's official designation within the bank.</w:t>
+      </w:r>
+    </w:p>
+    <w:p>
+      <w:pPr>
+        <w:pStyle w:val="Heading2"/>
+        <w:rPr>
+          <w:sz w:val="24"/>
+          <w:szCs w:val="24"/>
+        </w:rPr>
+      </w:pPr>
+      <w:r>
+        <w:rPr>
+          <w:sz w:val="24"/>
+          <w:szCs w:val="24"/>
+        </w:rPr>
+        <w:t>Examples:</w:t>
+      </w:r>
+    </w:p>
+    <w:p>
+      <w:pPr>
+        <w:pStyle w:val="Heading2"/>
+        <w:numPr>
+          <w:ilvl w:val="0"/>
+          <w:numId w:val="32"/>
+        </w:numPr>
+        <w:rPr>
+          <w:sz w:val="24"/>
+          <w:szCs w:val="24"/>
+        </w:rPr>
+      </w:pPr>
+      <w:r>
+        <w:rPr>
+          <w:sz w:val="24"/>
+          <w:szCs w:val="24"/>
+        </w:rPr>
+        <w:t xml:space="preserve">Senior Manager </w:t>
+      </w:r>
+    </w:p>
+    <w:p>
+      <w:pPr>
+        <w:pStyle w:val="Heading2"/>
+        <w:numPr>
+          <w:ilvl w:val="0"/>
+          <w:numId w:val="32"/>
+        </w:numPr>
+        <w:rPr>
+          <w:sz w:val="24"/>
+          <w:szCs w:val="24"/>
+        </w:rPr>
+      </w:pPr>
+      <w:r>
+        <w:rPr>
+          <w:sz w:val="24"/>
+          <w:szCs w:val="24"/>
+        </w:rPr>
+        <w:t xml:space="preserve">Senior Manager 1 </w:t>
+      </w:r>
+    </w:p>
+    <w:p>
+      <w:pPr>
+        <w:pStyle w:val="Heading2"/>
+        <w:numPr>
+          <w:ilvl w:val="0"/>
+          <w:numId w:val="32"/>
+        </w:numPr>
+        <w:rPr>
+          <w:sz w:val="24"/>
+          <w:szCs w:val="24"/>
+        </w:rPr>
+      </w:pPr>
+      <w:r>
+        <w:rPr>
+          <w:sz w:val="24"/>
+          <w:szCs w:val="24"/>
+        </w:rPr>
+        <w:t xml:space="preserve">Manager </w:t>
+      </w:r>
+    </w:p>
+    <w:p>
+      <w:pPr>
+        <w:pStyle w:val="Heading2"/>
+        <w:numPr>
+          <w:ilvl w:val="0"/>
+          <w:numId w:val="32"/>
+        </w:numPr>
+        <w:rPr>
+          <w:sz w:val="24"/>
+          <w:szCs w:val="24"/>
+        </w:rPr>
+      </w:pPr>
+      <w:r>
+        <w:rPr>
+          <w:sz w:val="24"/>
+          <w:szCs w:val="24"/>
+        </w:rPr>
+        <w:t xml:space="preserve">Assistant Manager </w:t>
+      </w:r>
+    </w:p>
+    <w:p>
+      <w:pPr>
+        <w:pStyle w:val="Heading2"/>
+        <w:numPr>
+          <w:ilvl w:val="0"/>
+          <w:numId w:val="32"/>
+        </w:numPr>
+        <w:rPr>
+          <w:sz w:val="24"/>
+          <w:szCs w:val="24"/>
+        </w:rPr>
+      </w:pPr>
+      <w:r>
+        <w:rPr>
+          <w:sz w:val="24"/>
+          <w:szCs w:val="24"/>
+        </w:rPr>
+        <w:t xml:space="preserve">Upper Division Assistant (UDA) </w:t>
+      </w:r>
+    </w:p>
+    <w:p>
+      <w:pPr>
+        <w:pStyle w:val="Heading2"/>
+        <w:numPr>
+          <w:ilvl w:val="0"/>
+          <w:numId w:val="32"/>
+        </w:numPr>
+        <w:rPr>
+          <w:sz w:val="24"/>
+          <w:szCs w:val="24"/>
+        </w:rPr>
+      </w:pPr>
+      <w:r>
+        <w:rPr>
+          <w:sz w:val="24"/>
+          <w:szCs w:val="24"/>
+        </w:rPr>
+        <w:t xml:space="preserve">Lower Division Assistant (LDA) </w:t>
+      </w:r>
+    </w:p>
+    <w:p>
+      <w:pPr>
+        <w:pStyle w:val="Heading2"/>
+        <w:numPr>
+          <w:ilvl w:val="0"/>
+          <w:numId w:val="32"/>
+        </w:numPr>
+        <w:rPr>
+          <w:sz w:val="24"/>
+          <w:szCs w:val="24"/>
+        </w:rPr>
+      </w:pPr>
+      <w:r>
+        <w:rPr>
+          <w:sz w:val="24"/>
+          <w:szCs w:val="24"/>
+        </w:rPr>
+        <w:t xml:space="preserve">Group D </w:t>
+      </w:r>
+    </w:p>
+    <w:p>
+      <w:pPr>
+        <w:pStyle w:val="Heading2"/>
+        <w:rPr>
+          <w:sz w:val="24"/>
+          <w:szCs w:val="24"/>
+        </w:rPr>
+      </w:pPr>
+      <w:r>
+        <w:rPr>
+          <w:sz w:val="24"/>
+          <w:szCs w:val="24"/>
+        </w:rPr>
+        <w:t>2. Application User Type</w:t>
+      </w:r>
+    </w:p>
+    <w:p>
+      <w:pPr>
+        <w:pStyle w:val="Heading2"/>
+        <w:rPr>
+          <w:sz w:val="24"/>
+          <w:szCs w:val="24"/>
+        </w:rPr>
+      </w:pPr>
+      <w:r>
+        <w:rPr>
+          <w:sz w:val="24"/>
+          <w:szCs w:val="24"/>
+        </w:rPr>
+        <w:lastRenderedPageBreak/>
+        <w:t>This represents the employee's access level within the application.</w:t>
+      </w:r>
+    </w:p>
+    <w:p>
+      <w:pPr>
+        <w:pStyle w:val="Heading2"/>
+        <w:rPr>
+          <w:sz w:val="24"/>
+          <w:szCs w:val="24"/>
+        </w:rPr>
+      </w:pPr>
+      <w:r>
+        <w:rPr>
+          <w:sz w:val="24"/>
+          <w:szCs w:val="24"/>
+        </w:rPr>
+        <w:t>Examples:</w:t>
+      </w:r>
+    </w:p>
+    <w:p>
+      <w:pPr>
+        <w:pStyle w:val="Heading2"/>
+        <w:numPr>
+          <w:ilvl w:val="0"/>
+          <w:numId w:val="33"/>
+        </w:numPr>
+        <w:rPr>
+          <w:sz w:val="24"/>
+          <w:szCs w:val="24"/>
+        </w:rPr>
+      </w:pPr>
+      <w:r>
+        <w:rPr>
+          <w:sz w:val="24"/>
+          <w:szCs w:val="24"/>
+        </w:rPr>
+        <w:t xml:space="preserve">Admin </w:t>
+      </w:r>
+    </w:p>
+    <w:p>
+      <w:pPr>
+        <w:pStyle w:val="Heading2"/>
+        <w:numPr>
+          <w:ilvl w:val="0"/>
+          <w:numId w:val="33"/>
+        </w:numPr>
+        <w:rPr>
+          <w:sz w:val="24"/>
+          <w:szCs w:val="24"/>
+        </w:rPr>
+      </w:pPr>
+      <w:r>
+        <w:rPr>
+          <w:sz w:val="24"/>
+          <w:szCs w:val="24"/>
+        </w:rPr>
+        <w:t xml:space="preserve">Payroll User </w:t>
+      </w:r>
+    </w:p>
+    <w:p>
+      <w:pPr>
+        <w:pStyle w:val="Heading2"/>
+        <w:numPr>
+          <w:ilvl w:val="0"/>
+          <w:numId w:val="33"/>
+        </w:numPr>
+        <w:rPr>
+          <w:sz w:val="24"/>
+          <w:szCs w:val="24"/>
+        </w:rPr>
+      </w:pPr>
+      <w:r>
+        <w:rPr>
+          <w:sz w:val="24"/>
+          <w:szCs w:val="24"/>
+        </w:rPr>
+        <w:t xml:space="preserve">Attendance User </w:t>
+      </w:r>
+    </w:p>
+    <w:p>
+      <w:pPr>
+        <w:pStyle w:val="Heading2"/>
+        <w:numPr>
+          <w:ilvl w:val="0"/>
+          <w:numId w:val="33"/>
+        </w:numPr>
+        <w:rPr>
+          <w:sz w:val="24"/>
+          <w:szCs w:val="24"/>
+        </w:rPr>
+      </w:pPr>
+      <w:r>
+        <w:rPr>
+          <w:sz w:val="24"/>
+          <w:szCs w:val="24"/>
+        </w:rPr>
+        <w:t xml:space="preserve">User </w:t>
+      </w:r>
+    </w:p>
+    <w:p>
+      <w:pPr>
+        <w:pStyle w:val="Heading2"/>
+        <w:rPr>
+          <w:sz w:val="24"/>
+          <w:szCs w:val="24"/>
+        </w:rPr>
+      </w:pPr>
+      <w:r>
+        <w:rPr>
+          <w:sz w:val="24"/>
+          <w:szCs w:val="24"/>
+        </w:rPr>
+        <w:pict>
+          <v:rect id="_x0000_i1026" style="width:0;height:1.5pt" o:hralign="center" o:hrstd="t" o:hr="t" fillcolor="#a0a0a0" stroked="f"/>
+        </w:pict>
+      </w:r>
+    </w:p>
+    <w:p>
+      <w:pPr>
+        <w:pStyle w:val="Heading2"/>
+        <w:rPr>
+          <w:sz w:val="24"/>
+          <w:szCs w:val="24"/>
+        </w:rPr>
+      </w:pPr>
+      <w:r>
+        <w:rPr>
+          <w:sz w:val="24"/>
+          <w:szCs w:val="24"/>
+        </w:rPr>
+        <w:t>Dynamic Role Assignment</w:t>
+      </w:r>
+    </w:p>
+    <w:p>
+      <w:pPr>
+        <w:pStyle w:val="Heading2"/>
+        <w:numPr>
+          <w:ilvl w:val="0"/>
+          <w:numId w:val="34"/>
+        </w:numPr>
+        <w:rPr>
+          <w:sz w:val="24"/>
+          <w:szCs w:val="24"/>
+        </w:rPr>
+      </w:pPr>
+      <w:r>
+        <w:rPr>
+          <w:sz w:val="24"/>
+          <w:szCs w:val="24"/>
+        </w:rPr>
+        <w:t xml:space="preserve">The mapping between Bank Designation and Application User Type will be fully dynamic. </w:t>
+      </w:r>
+    </w:p>
+    <w:p>
+      <w:pPr>
+        <w:pStyle w:val="Heading2"/>
+        <w:numPr>
+          <w:ilvl w:val="0"/>
+          <w:numId w:val="34"/>
+        </w:numPr>
+        <w:rPr>
+          <w:sz w:val="24"/>
+          <w:szCs w:val="24"/>
+        </w:rPr>
+      </w:pPr>
+      <w:r>
+        <w:rPr>
+          <w:sz w:val="24"/>
+          <w:szCs w:val="24"/>
+        </w:rPr>
+        <w:t>The Admin can assign any Application User Type to any</w:t>
+      </w:r>
+      <w:r>
+        <w:rPr>
+          <w:sz w:val="24"/>
+          <w:szCs w:val="24"/>
+        </w:rPr>
+        <w:t xml:space="preserve"> employee with any</w:t>
+      </w:r>
+      <w:r>
+        <w:rPr>
+          <w:sz w:val="24"/>
+          <w:szCs w:val="24"/>
+        </w:rPr>
+        <w:t xml:space="preserve"> Bank Designation as per business requirements. </w:t>
+      </w:r>
+    </w:p>
+    <w:p>
+      <w:pPr>
+        <w:pStyle w:val="Heading2"/>
+        <w:numPr>
+          <w:ilvl w:val="0"/>
+          <w:numId w:val="34"/>
+        </w:numPr>
+        <w:rPr>
+          <w:sz w:val="24"/>
+          <w:szCs w:val="24"/>
+        </w:rPr>
+      </w:pPr>
+      <w:r>
+        <w:rPr>
+          <w:sz w:val="24"/>
+          <w:szCs w:val="24"/>
+        </w:rPr>
+        <w:t xml:space="preserve">A user's application permissions will be determined by the assigned User Type, not by the Bank Designation. </w:t>
+      </w:r>
+    </w:p>
+    <w:p>
+      <w:pPr>
+        <w:pStyle w:val="Heading2"/>
+        <w:numPr>
+          <w:ilvl w:val="0"/>
+          <w:numId w:val="34"/>
+        </w:numPr>
+        <w:rPr>
+          <w:sz w:val="24"/>
+          <w:szCs w:val="24"/>
+        </w:rPr>
+      </w:pPr>
+      <w:r>
+        <w:rPr>
+          <w:sz w:val="24"/>
+          <w:szCs w:val="24"/>
+        </w:rPr>
+        <w:t xml:space="preserve">The same </w:t>
+      </w:r>
+      <w:r>
+        <w:rPr>
+          <w:sz w:val="24"/>
+          <w:szCs w:val="24"/>
+        </w:rPr>
+        <w:t xml:space="preserve">User Types </w:t>
+      </w:r>
+      <w:r>
+        <w:rPr>
+          <w:sz w:val="24"/>
+          <w:szCs w:val="24"/>
+        </w:rPr>
+        <w:t xml:space="preserve">can be assigned different </w:t>
+      </w:r>
+      <w:r>
+        <w:rPr>
+          <w:sz w:val="24"/>
+          <w:szCs w:val="24"/>
+        </w:rPr>
+        <w:t xml:space="preserve">employees with different </w:t>
+      </w:r>
+      <w:r>
+        <w:rPr>
+          <w:sz w:val="24"/>
+          <w:szCs w:val="24"/>
+        </w:rPr>
+        <w:t xml:space="preserve">Bank Designation </w:t>
+      </w:r>
+      <w:r>
+        <w:rPr>
+          <w:sz w:val="24"/>
+          <w:szCs w:val="24"/>
+        </w:rPr>
+        <w:t xml:space="preserve">if required. </w:t>
+      </w:r>
+    </w:p>
+    <w:p>
+      <w:pPr>
+        <w:pStyle w:val="Heading2"/>
+        <w:rPr>
+          <w:sz w:val="24"/>
+          <w:szCs w:val="24"/>
+        </w:rPr>
+      </w:pPr>
+      <w:r>
+        <w:rPr>
+          <w:sz w:val="24"/>
+          <w:szCs w:val="24"/>
+        </w:rPr>
+        <w:t>Example:</w:t>
+      </w:r>
+    </w:p>
+    <w:p>
+      <w:pPr>
+        <w:pStyle w:val="Heading2"/>
+        <w:numPr>
+          <w:ilvl w:val="0"/>
+          <w:numId w:val="35"/>
+        </w:numPr>
+        <w:rPr>
+          <w:sz w:val="24"/>
+          <w:szCs w:val="24"/>
+        </w:rPr>
+      </w:pPr>
+      <w:r>
+        <w:rPr>
+          <w:sz w:val="24"/>
+          <w:szCs w:val="24"/>
+        </w:rPr>
+        <w:t xml:space="preserve">A Manager may be assigned as an Admin. </w:t>
+      </w:r>
+    </w:p>
+    <w:p>
+      <w:pPr>
+        <w:pStyle w:val="Heading2"/>
+        <w:numPr>
+          <w:ilvl w:val="0"/>
+          <w:numId w:val="35"/>
+        </w:numPr>
+        <w:rPr>
+          <w:sz w:val="24"/>
+          <w:szCs w:val="24"/>
+        </w:rPr>
+      </w:pPr>
+      <w:r>
+        <w:rPr>
+          <w:sz w:val="24"/>
+          <w:szCs w:val="24"/>
+        </w:rPr>
+        <w:t xml:space="preserve">Another Manager may be assigned as a Payroll User. </w:t>
+      </w:r>
+    </w:p>
+    <w:p>
+      <w:pPr>
+        <w:pStyle w:val="Heading2"/>
+        <w:numPr>
+          <w:ilvl w:val="0"/>
+          <w:numId w:val="35"/>
+        </w:numPr>
+        <w:rPr>
+          <w:sz w:val="24"/>
+          <w:szCs w:val="24"/>
+        </w:rPr>
+      </w:pPr>
+      <w:r>
+        <w:rPr>
+          <w:sz w:val="24"/>
+          <w:szCs w:val="24"/>
+        </w:rPr>
+        <w:t xml:space="preserve">Another Manager may be assigned as a regular User. </w:t>
+      </w:r>
+    </w:p>
+    <w:p>
+      <w:pPr>
+        <w:pStyle w:val="Heading2"/>
+        <w:rPr>
+          <w:sz w:val="24"/>
+          <w:szCs w:val="24"/>
+        </w:rPr>
+      </w:pPr>
+      <w:r>
+        <w:rPr>
+          <w:sz w:val="24"/>
+          <w:szCs w:val="24"/>
+        </w:rPr>
+        <w:pict>
+          <v:rect id="_x0000_i1027" style="width:0;height:1.5pt" o:hralign="center" o:hrstd="t" o:hr="t" fillcolor="#a0a0a0" stroked="f"/>
+        </w:pict>
+      </w:r>
+    </w:p>
+    <w:p>
+      <w:pPr>
+        <w:pStyle w:val="Heading2"/>
+        <w:rPr>
+          <w:sz w:val="24"/>
+          <w:szCs w:val="24"/>
+        </w:rPr>
+      </w:pPr>
+      <w:r>
+        <w:rPr>
+          <w:sz w:val="24"/>
+          <w:szCs w:val="24"/>
+        </w:rPr>
+        <w:t>Admin as Employee</w:t>
+      </w:r>
+    </w:p>
+    <w:p>
+      <w:pPr>
+        <w:pStyle w:val="Heading2"/>
+        <w:numPr>
+          <w:ilvl w:val="0"/>
+          <w:numId w:val="36"/>
+        </w:numPr>
+        <w:rPr>
+          <w:sz w:val="24"/>
+          <w:szCs w:val="24"/>
+        </w:rPr>
+      </w:pPr>
+      <w:r>
+        <w:rPr>
+          <w:sz w:val="24"/>
+          <w:szCs w:val="24"/>
+        </w:rPr>
+        <w:t xml:space="preserve">The Admin is also an employee of the bank and will have a Bank Designation like all other employees. </w:t>
+      </w:r>
+    </w:p>
+    <w:p>
+      <w:pPr>
+        <w:pStyle w:val="Heading2"/>
+        <w:numPr>
+          <w:ilvl w:val="0"/>
+          <w:numId w:val="36"/>
+        </w:numPr>
+        <w:rPr>
+          <w:sz w:val="24"/>
+          <w:szCs w:val="24"/>
+        </w:rPr>
+      </w:pPr>
+      <w:r>
+        <w:rPr>
+          <w:sz w:val="24"/>
+          <w:szCs w:val="24"/>
+        </w:rPr>
+        <w:t xml:space="preserve">An Admin can hold any Bank Designation. </w:t>
+      </w:r>
+    </w:p>
+    <w:p>
+      <w:pPr>
+        <w:pStyle w:val="Heading2"/>
+        <w:numPr>
+          <w:ilvl w:val="0"/>
+          <w:numId w:val="36"/>
+        </w:numPr>
+        <w:rPr>
+          <w:sz w:val="24"/>
+          <w:szCs w:val="24"/>
+        </w:rPr>
+      </w:pPr>
+      <w:r>
+        <w:rPr>
+          <w:sz w:val="24"/>
+          <w:szCs w:val="24"/>
+        </w:rPr>
+        <w:t xml:space="preserve">An Admin can update and manage both: </w:t>
+      </w:r>
+    </w:p>
+    <w:p>
+      <w:pPr>
+        <w:pStyle w:val="Heading2"/>
+        <w:numPr>
+          <w:ilvl w:val="1"/>
+          <w:numId w:val="36"/>
+        </w:numPr>
+        <w:rPr>
+          <w:sz w:val="24"/>
+          <w:szCs w:val="24"/>
+        </w:rPr>
+      </w:pPr>
+      <w:r>
+        <w:rPr>
+          <w:sz w:val="24"/>
+          <w:szCs w:val="24"/>
+        </w:rPr>
+        <w:t xml:space="preserve">Bank Designation </w:t>
+      </w:r>
+    </w:p>
+    <w:p>
+      <w:pPr>
+        <w:pStyle w:val="Heading2"/>
+        <w:numPr>
+          <w:ilvl w:val="1"/>
+          <w:numId w:val="36"/>
+        </w:numPr>
+        <w:rPr>
+          <w:sz w:val="24"/>
+          <w:szCs w:val="24"/>
+        </w:rPr>
+      </w:pPr>
+      <w:r>
+        <w:rPr>
+          <w:sz w:val="24"/>
+          <w:szCs w:val="24"/>
+        </w:rPr>
+        <w:t xml:space="preserve">Application User Type </w:t>
+      </w:r>
+    </w:p>
+    <w:p>
+      <w:pPr>
+        <w:pStyle w:val="Heading2"/>
+        <w:numPr>
+          <w:ilvl w:val="0"/>
+          <w:numId w:val="36"/>
+        </w:numPr>
+        <w:rPr>
+          <w:sz w:val="24"/>
+          <w:szCs w:val="24"/>
+        </w:rPr>
+      </w:pPr>
+      <w:r>
+        <w:rPr>
+          <w:sz w:val="24"/>
+          <w:szCs w:val="24"/>
+        </w:rPr>
+        <w:t>All such changes shall be recorded in the system audit trail</w:t>
+      </w:r>
+      <w:r>
+        <w:rPr>
+          <w:sz w:val="24"/>
+          <w:szCs w:val="24"/>
+        </w:rPr>
+        <w:t xml:space="preserve">( to be done </w:t>
       </w:r>
       <w:bookmarkStart w:id="0" w:name="_GoBack"/>
       <w:bookmarkEnd w:id="0"/>
       <w:r>
-        <w:t>yees to digitally claim travel or medical expenses with multi-level routing.</w:t>
-      </w:r>
-    </w:p>
-    <w:p>
-      <w:pPr>
-        <w:pStyle w:val="Heading3"/>
-      </w:pPr>
-      <w:r>
-        <w:t xml:space="preserve">2.8. </w:t>
-      </w:r>
-      <w:proofErr w:type="spellStart"/>
-      <w:r>
-        <w:t>Offboarding</w:t>
-      </w:r>
-      <w:proofErr w:type="spellEnd"/>
-      <w:r>
-        <w:t xml:space="preserve"> &amp; Exit Management (Future Scope &amp; Further Discussions)</w:t>
-      </w:r>
-    </w:p>
-    <w:p>
-      <w:pPr>
-        <w:pStyle w:val="NormalWeb"/>
-        <w:numPr>
-          <w:ilvl w:val="0"/>
-          <w:numId w:val="21"/>
-        </w:numPr>
-      </w:pPr>
-      <w:r>
-        <w:rPr>
-          <w:rStyle w:val="Strong"/>
-        </w:rPr>
-        <w:t>Exit Workflows:</w:t>
-      </w:r>
-      <w:r>
-        <w:t xml:space="preserve"> Resignation portal, automated IT/Admin clearance tasks, and Full &amp; Final (F&amp;F) settlement calculations.</w:t>
-      </w:r>
-    </w:p>
-    <w:p>
-      <w:pPr>
-        <w:pStyle w:val="Heading3"/>
-      </w:pPr>
-      <w:r>
-        <w:t>2.9. Employee Self-Service (ESS)</w:t>
-      </w:r>
-    </w:p>
-    <w:p>
-      <w:pPr>
-        <w:pStyle w:val="NormalWeb"/>
-        <w:numPr>
-          <w:ilvl w:val="0"/>
-          <w:numId w:val="22"/>
-        </w:numPr>
-      </w:pPr>
-      <w:r>
-        <w:rPr>
-          <w:rStyle w:val="Strong"/>
-        </w:rPr>
-        <w:t>Personal Dashboard:</w:t>
-      </w:r>
-      <w:r>
-        <w:t xml:space="preserve"> View biometric attendance logs, leave balances, </w:t>
-      </w:r>
-      <w:proofErr w:type="spellStart"/>
-      <w:r>
-        <w:t>payslips</w:t>
-      </w:r>
-      <w:proofErr w:type="spellEnd"/>
-      <w:r>
-        <w:t>, and apply for leaves.</w:t>
-      </w:r>
-    </w:p>
-    <w:p>
-      <w:pPr>
-        <w:pStyle w:val="Heading3"/>
-      </w:pPr>
-      <w:r>
-        <w:t>2.10. Employee Loans &amp; Advances (Future Scope &amp; Further Discussions)</w:t>
-      </w:r>
-    </w:p>
-    <w:p>
-      <w:pPr>
-        <w:pStyle w:val="NormalWeb"/>
-        <w:numPr>
-          <w:ilvl w:val="0"/>
-          <w:numId w:val="23"/>
-        </w:numPr>
-      </w:pPr>
-      <w:r>
-        <w:rPr>
-          <w:rStyle w:val="Strong"/>
-        </w:rPr>
-        <w:t>Sofia Integration:</w:t>
-      </w:r>
-      <w:r>
-        <w:t xml:space="preserve"> The HRMS will integrate with the bank's external core banking software, </w:t>
-      </w:r>
-      <w:r>
-        <w:rPr>
-          <w:rStyle w:val="Strong"/>
-        </w:rPr>
-        <w:t>"Sofia"</w:t>
-      </w:r>
-      <w:r>
-        <w:t>, via secure APIs or scheduled file drops.</w:t>
-      </w:r>
-    </w:p>
-    <w:p>
-      <w:pPr>
-        <w:pStyle w:val="NormalWeb"/>
-        <w:numPr>
-          <w:ilvl w:val="0"/>
-          <w:numId w:val="23"/>
-        </w:numPr>
-      </w:pPr>
-      <w:r>
-        <w:rPr>
-          <w:rStyle w:val="Strong"/>
-        </w:rPr>
-        <w:t>Data Sync:</w:t>
-      </w:r>
-      <w:r>
-        <w:t xml:space="preserve"> The system will receive automated data feeds containing active employee loan details and EMI schedules.</w:t>
-      </w:r>
-    </w:p>
-    <w:p>
-      <w:pPr>
-        <w:pStyle w:val="NormalWeb"/>
-        <w:numPr>
-          <w:ilvl w:val="0"/>
-          <w:numId w:val="23"/>
-        </w:numPr>
-      </w:pPr>
-      <w:r>
-        <w:rPr>
-          <w:rStyle w:val="Strong"/>
-        </w:rPr>
-        <w:t>Payroll Processing:</w:t>
-      </w:r>
-      <w:r>
-        <w:t xml:space="preserve"> Synchronized loan EMI amounts will be automatically treated as deductions during the monthly payroll run.</w:t>
-      </w:r>
-    </w:p>
-    <w:p>
-      <w:pPr>
-        <w:pStyle w:val="Heading2"/>
-      </w:pPr>
-      <w:r>
-        <w:t>3. User Roles &amp; Access Control (RBAC)</w:t>
-      </w:r>
-    </w:p>
-    <w:p>
-      <w:pPr>
-        <w:pStyle w:val="NormalWeb"/>
-        <w:numPr>
-          <w:ilvl w:val="0"/>
-          <w:numId w:val="24"/>
-        </w:numPr>
-      </w:pPr>
-      <w:r>
-        <w:rPr>
-          <w:rStyle w:val="Strong"/>
-        </w:rPr>
-        <w:t>System Admin (IT):</w:t>
-      </w:r>
-      <w:r>
-        <w:t xml:space="preserve"> Full technical configuration, integration monitoring, and backup management.</w:t>
-      </w:r>
-    </w:p>
-    <w:p>
-      <w:pPr>
-        <w:pStyle w:val="NormalWeb"/>
-        <w:numPr>
-          <w:ilvl w:val="0"/>
-          <w:numId w:val="24"/>
-        </w:numPr>
-      </w:pPr>
-      <w:r>
-        <w:rPr>
-          <w:rStyle w:val="Strong"/>
-        </w:rPr>
-        <w:t>HR Admin:</w:t>
-      </w:r>
-      <w:r>
-        <w:t xml:space="preserve"> Full access to all HR modules, bulk biometric uploads, Holiday Calendar management, Basic Pay Scale maintenance, and payroll execution.</w:t>
-      </w:r>
-    </w:p>
-    <w:p>
-      <w:pPr>
-        <w:pStyle w:val="NormalWeb"/>
-        <w:numPr>
-          <w:ilvl w:val="0"/>
-          <w:numId w:val="24"/>
-        </w:numPr>
-      </w:pPr>
-      <w:r>
-        <w:rPr>
-          <w:rStyle w:val="Strong"/>
-        </w:rPr>
-        <w:t>Branch/Department Manager:</w:t>
-      </w:r>
-      <w:r>
-        <w:t xml:space="preserve"> Access to view team attendance and approve leaves.</w:t>
-      </w:r>
-    </w:p>
-    <w:p>
-      <w:pPr>
-        <w:pStyle w:val="NormalWeb"/>
-        <w:numPr>
-          <w:ilvl w:val="0"/>
-          <w:numId w:val="24"/>
-        </w:numPr>
-      </w:pPr>
-      <w:r>
-        <w:rPr>
-          <w:rStyle w:val="Strong"/>
-        </w:rPr>
-        <w:t>Employee:</w:t>
-      </w:r>
-      <w:r>
-        <w:t xml:space="preserve"> Restricted access to view own data and apply for leaves.</w:t>
+        <w:rPr>
+          <w:sz w:val="24"/>
+          <w:szCs w:val="24"/>
+        </w:rPr>
+        <w:t>later )</w:t>
+      </w:r>
+      <w:r>
+        <w:rPr>
+          <w:sz w:val="24"/>
+          <w:szCs w:val="24"/>
+        </w:rPr>
+        <w:t>.</w:t>
       </w:r>
     </w:p>
     <w:p>
@@ -1687,6 +3165,7 @@
         <w:rPr>
           <w:rStyle w:val="Strong"/>
         </w:rPr>
+        <w:lastRenderedPageBreak/>
         <w:t>External Integration:</w:t>
       </w:r>
       <w:r>
@@ -1708,8 +3187,365 @@
         <w:t>Audit Trails &amp; Security:</w:t>
       </w:r>
       <w:r>
-        <w:t xml:space="preserve"> Maker-Checker workflows for payroll finalization; strict audit logging for biometric ingestion, expired leaves, external data syncs, and salary adjustments.</w:t>
-      </w:r>
+        <w:t xml:space="preserve"> </w:t>
+      </w:r>
+      <w:r>
+        <w:t>Audit Trails, Monitoring &amp; Security</w:t>
+      </w:r>
+    </w:p>
+    <w:p>
+      <w:pPr>
+        <w:pStyle w:val="NormalWeb"/>
+        <w:numPr>
+          <w:ilvl w:val="0"/>
+          <w:numId w:val="27"/>
+        </w:numPr>
+      </w:pPr>
+      <w:r>
+        <w:t>Comprehensive User Activity Auditing: The system shall maintain a complete, tamper-resistant audit trail for all user activities across the application, including but not limited to:</w:t>
+      </w:r>
+    </w:p>
+    <w:p>
+      <w:pPr>
+        <w:pStyle w:val="NormalWeb"/>
+        <w:numPr>
+          <w:ilvl w:val="0"/>
+          <w:numId w:val="27"/>
+        </w:numPr>
+      </w:pPr>
+      <w:r>
+        <w:t>User login and logout events.</w:t>
+      </w:r>
+    </w:p>
+    <w:p>
+      <w:pPr>
+        <w:pStyle w:val="NormalWeb"/>
+        <w:numPr>
+          <w:ilvl w:val="0"/>
+          <w:numId w:val="27"/>
+        </w:numPr>
+      </w:pPr>
+      <w:r>
+        <w:t>Session start and end times.</w:t>
+      </w:r>
+    </w:p>
+    <w:p>
+      <w:pPr>
+        <w:pStyle w:val="NormalWeb"/>
+        <w:numPr>
+          <w:ilvl w:val="0"/>
+          <w:numId w:val="27"/>
+        </w:numPr>
+      </w:pPr>
+      <w:r>
+        <w:t>Every page, screen, module, and section accessed by a user.</w:t>
+      </w:r>
+    </w:p>
+    <w:p>
+      <w:pPr>
+        <w:pStyle w:val="NormalWeb"/>
+        <w:numPr>
+          <w:ilvl w:val="0"/>
+          <w:numId w:val="27"/>
+        </w:numPr>
+      </w:pPr>
+      <w:r>
+        <w:t xml:space="preserve">Every button </w:t>
+      </w:r>
+      <w:proofErr w:type="gramStart"/>
+      <w:r>
+        <w:t>click</w:t>
+      </w:r>
+      <w:proofErr w:type="gramEnd"/>
+      <w:r>
+        <w:t>, menu selection, search operation, and navigation action performed.</w:t>
+      </w:r>
+    </w:p>
+    <w:p>
+      <w:pPr>
+        <w:pStyle w:val="NormalWeb"/>
+        <w:numPr>
+          <w:ilvl w:val="0"/>
+          <w:numId w:val="27"/>
+        </w:numPr>
+      </w:pPr>
+      <w:r>
+        <w:t>All Create, Read, Update, Delete (CRUD) operations on data.</w:t>
+      </w:r>
+    </w:p>
+    <w:p>
+      <w:pPr>
+        <w:pStyle w:val="NormalWeb"/>
+        <w:numPr>
+          <w:ilvl w:val="0"/>
+          <w:numId w:val="27"/>
+        </w:numPr>
+      </w:pPr>
+      <w:r>
+        <w:t>Record views, downloads, exports, print actions, and report generation.</w:t>
+      </w:r>
+    </w:p>
+    <w:p>
+      <w:pPr>
+        <w:pStyle w:val="NormalWeb"/>
+        <w:numPr>
+          <w:ilvl w:val="0"/>
+          <w:numId w:val="27"/>
+        </w:numPr>
+      </w:pPr>
+      <w:r>
+        <w:t>Workflow approvals, rejections, submissions, and status changes.</w:t>
+      </w:r>
+    </w:p>
+    <w:p>
+      <w:pPr>
+        <w:pStyle w:val="NormalWeb"/>
+        <w:numPr>
+          <w:ilvl w:val="0"/>
+          <w:numId w:val="27"/>
+        </w:numPr>
+      </w:pPr>
+      <w:r>
+        <w:t>Configuration changes, master data modifications, and security-related actions.</w:t>
+      </w:r>
+    </w:p>
+    <w:p>
+      <w:pPr>
+        <w:pStyle w:val="NormalWeb"/>
+        <w:numPr>
+          <w:ilvl w:val="0"/>
+          <w:numId w:val="27"/>
+        </w:numPr>
+      </w:pPr>
+      <w:r>
+        <w:t>API calls, third-party integrations, data imports, and data synchronization activities.</w:t>
+      </w:r>
+    </w:p>
+    <w:p>
+      <w:pPr>
+        <w:pStyle w:val="NormalWeb"/>
+        <w:numPr>
+          <w:ilvl w:val="0"/>
+          <w:numId w:val="27"/>
+        </w:numPr>
+      </w:pPr>
+      <w:r>
+        <w:t>Detailed Audit Information: Each audit entry shall capture:</w:t>
+      </w:r>
+    </w:p>
+    <w:p>
+      <w:pPr>
+        <w:pStyle w:val="NormalWeb"/>
+        <w:numPr>
+          <w:ilvl w:val="0"/>
+          <w:numId w:val="27"/>
+        </w:numPr>
+      </w:pPr>
+      <w:r>
+        <w:t>User ID and username.</w:t>
+      </w:r>
+    </w:p>
+    <w:p>
+      <w:pPr>
+        <w:pStyle w:val="NormalWeb"/>
+        <w:numPr>
+          <w:ilvl w:val="0"/>
+          <w:numId w:val="27"/>
+        </w:numPr>
+      </w:pPr>
+      <w:r>
+        <w:t>User role/designation.</w:t>
+      </w:r>
+    </w:p>
+    <w:p>
+      <w:pPr>
+        <w:pStyle w:val="NormalWeb"/>
+        <w:numPr>
+          <w:ilvl w:val="0"/>
+          <w:numId w:val="27"/>
+        </w:numPr>
+      </w:pPr>
+      <w:r>
+        <w:t>Date and timestamp.</w:t>
+      </w:r>
+    </w:p>
+    <w:p>
+      <w:pPr>
+        <w:pStyle w:val="NormalWeb"/>
+        <w:numPr>
+          <w:ilvl w:val="0"/>
+          <w:numId w:val="27"/>
+        </w:numPr>
+      </w:pPr>
+      <w:r>
+        <w:t>IP address.</w:t>
+      </w:r>
+    </w:p>
+    <w:p>
+      <w:pPr>
+        <w:pStyle w:val="NormalWeb"/>
+        <w:numPr>
+          <w:ilvl w:val="0"/>
+          <w:numId w:val="27"/>
+        </w:numPr>
+      </w:pPr>
+      <w:r>
+        <w:t>Device/browser information.</w:t>
+      </w:r>
+    </w:p>
+    <w:p>
+      <w:pPr>
+        <w:pStyle w:val="NormalWeb"/>
+        <w:numPr>
+          <w:ilvl w:val="0"/>
+          <w:numId w:val="27"/>
+        </w:numPr>
+      </w:pPr>
+      <w:r>
+        <w:t>Module and screen name.</w:t>
+      </w:r>
+    </w:p>
+    <w:p>
+      <w:pPr>
+        <w:pStyle w:val="NormalWeb"/>
+        <w:numPr>
+          <w:ilvl w:val="0"/>
+          <w:numId w:val="27"/>
+        </w:numPr>
+      </w:pPr>
+      <w:r>
+        <w:t>Action performed.</w:t>
+      </w:r>
+    </w:p>
+    <w:p>
+      <w:pPr>
+        <w:pStyle w:val="NormalWeb"/>
+        <w:numPr>
+          <w:ilvl w:val="0"/>
+          <w:numId w:val="27"/>
+        </w:numPr>
+      </w:pPr>
+      <w:r>
+        <w:t>Record/entity affected.</w:t>
+      </w:r>
+    </w:p>
+    <w:p>
+      <w:pPr>
+        <w:pStyle w:val="NormalWeb"/>
+        <w:numPr>
+          <w:ilvl w:val="0"/>
+          <w:numId w:val="27"/>
+        </w:numPr>
+      </w:pPr>
+      <w:r>
+        <w:t>Previous value and new value (where applicable).</w:t>
+      </w:r>
+    </w:p>
+    <w:p>
+      <w:pPr>
+        <w:pStyle w:val="NormalWeb"/>
+        <w:numPr>
+          <w:ilvl w:val="0"/>
+          <w:numId w:val="27"/>
+        </w:numPr>
+      </w:pPr>
+      <w:r>
+        <w:t>Success/failure status.</w:t>
+      </w:r>
+    </w:p>
+    <w:p>
+      <w:pPr>
+        <w:pStyle w:val="NormalWeb"/>
+        <w:numPr>
+          <w:ilvl w:val="0"/>
+          <w:numId w:val="27"/>
+        </w:numPr>
+      </w:pPr>
+      <w:r>
+        <w:t>Session identifier.</w:t>
+      </w:r>
+    </w:p>
+    <w:p>
+      <w:pPr>
+        <w:pStyle w:val="NormalWeb"/>
+        <w:numPr>
+          <w:ilvl w:val="0"/>
+          <w:numId w:val="27"/>
+        </w:numPr>
+      </w:pPr>
+      <w:r>
+        <w:t>Employee &amp; Payroll Audit Controls: All employee master updates, attendance transactions, biometric data ingestion, leave processing, payroll calculations, salary revisions, arrears processing, statutory deductions, and payroll finalization activities shall be fully auditable with complete change history.</w:t>
+      </w:r>
+    </w:p>
+    <w:p>
+      <w:pPr>
+        <w:pStyle w:val="NormalWeb"/>
+        <w:numPr>
+          <w:ilvl w:val="0"/>
+          <w:numId w:val="27"/>
+        </w:numPr>
+      </w:pPr>
+      <w:r>
+        <w:t>Maker-Checker Governance: Critical processes such as payroll finalization, salary revisions, employee status changes, and financial approvals shall follow a Maker-Checker workflow, with all actions and approvals permanently recorded in the audit trail.</w:t>
+      </w:r>
+    </w:p>
+    <w:p>
+      <w:pPr>
+        <w:pStyle w:val="NormalWeb"/>
+        <w:numPr>
+          <w:ilvl w:val="0"/>
+          <w:numId w:val="27"/>
+        </w:numPr>
+      </w:pPr>
+      <w:r>
+        <w:t>Administrative Activity Monitoring: Activities performed by System Administrators, HR Administrators, Payroll Administrators, and Super Users shall be audited with the same level of detail as regular users. No user shall be exempt from audit logging.</w:t>
+      </w:r>
+    </w:p>
+    <w:p>
+      <w:pPr>
+        <w:pStyle w:val="NormalWeb"/>
+        <w:numPr>
+          <w:ilvl w:val="0"/>
+          <w:numId w:val="27"/>
+        </w:numPr>
+      </w:pPr>
+      <w:r>
+        <w:t xml:space="preserve">Audit Retention &amp; Compliance: Audit logs shall be immutable, searchable, filterable, reportable, and retained according to organizational and regulatory requirements. Audit records shall not be editable or </w:t>
+      </w:r>
+      <w:proofErr w:type="spellStart"/>
+      <w:r>
+        <w:t>deletable</w:t>
+      </w:r>
+      <w:proofErr w:type="spellEnd"/>
+      <w:r>
+        <w:t xml:space="preserve"> by end users.</w:t>
+      </w:r>
+    </w:p>
+    <w:p>
+      <w:pPr>
+        <w:pStyle w:val="NormalWeb"/>
+        <w:numPr>
+          <w:ilvl w:val="0"/>
+          <w:numId w:val="27"/>
+        </w:numPr>
+      </w:pPr>
+      <w:r>
+        <w:t xml:space="preserve">End-to-End User Journey Tracking: The system shall maintain a complete chronological history of each user's movement within the application, from authentication (login) through every interaction and navigation event until session </w:t>
+      </w:r>
+      <w:r>
+        <w:lastRenderedPageBreak/>
+        <w:t>termination (logout), enabling full reconstruction of user activity for compliance, investigation, and security purposes.</w:t>
+      </w:r>
+    </w:p>
+    <w:p>
+      <w:pPr>
+        <w:pStyle w:val="NormalWeb"/>
+      </w:pPr>
+    </w:p>
+    <w:p>
+      <w:pPr>
+        <w:pStyle w:val="NormalWeb"/>
+      </w:pPr>
     </w:p>
     <w:p>
       <w:pPr>
@@ -1731,7 +3567,6 @@
         <w:rPr>
           <w:rStyle w:val="Strong"/>
         </w:rPr>
-        <w:lastRenderedPageBreak/>
         <w:t>Phase 1 (Foundation):</w:t>
       </w:r>
       <w:r>
@@ -2132,6 +3967,155 @@
     </w:lvl>
   </w:abstractNum>
   <w:abstractNum w:abstractNumId="2" w15:restartNumberingAfterBreak="0">
+    <w:nsid w:val="0DE840FF"/>
+    <w:multiLevelType w:val="multilevel"/>
+    <w:tmpl w:val="56E88C2E"/>
+    <w:lvl w:ilvl="0">
+      <w:start w:val="1"/>
+      <w:numFmt w:val="bullet"/>
+      <w:lvlText w:val=""/>
+      <w:lvlJc w:val="left"/>
+      <w:pPr>
+        <w:tabs>
+          <w:tab w:val="num" w:pos="720"/>
+        </w:tabs>
+        <w:ind w:left="720" w:hanging="360"/>
+      </w:pPr>
+      <w:rPr>
+        <w:rFonts w:ascii="Symbol" w:hAnsi="Symbol" w:hint="default"/>
+        <w:sz w:val="20"/>
+      </w:rPr>
+    </w:lvl>
+    <w:lvl w:ilvl="1">
+      <w:start w:val="1"/>
+      <w:numFmt w:val="bullet"/>
+      <w:lvlText w:val="o"/>
+      <w:lvlJc w:val="left"/>
+      <w:pPr>
+        <w:tabs>
+          <w:tab w:val="num" w:pos="1440"/>
+        </w:tabs>
+        <w:ind w:left="1440" w:hanging="360"/>
+      </w:pPr>
+      <w:rPr>
+        <w:rFonts w:ascii="Courier New" w:hAnsi="Courier New" w:hint="default"/>
+        <w:sz w:val="20"/>
+      </w:rPr>
+    </w:lvl>
+    <w:lvl w:ilvl="2" w:tentative="1">
+      <w:start w:val="1"/>
+      <w:numFmt w:val="bullet"/>
+      <w:lvlText w:val=""/>
+      <w:lvlJc w:val="left"/>
+      <w:pPr>
+        <w:tabs>
+          <w:tab w:val="num" w:pos="2160"/>
+        </w:tabs>
+        <w:ind w:left="2160" w:hanging="360"/>
+      </w:pPr>
+      <w:rPr>
+        <w:rFonts w:ascii="Wingdings" w:hAnsi="Wingdings" w:hint="default"/>
+        <w:sz w:val="20"/>
+      </w:rPr>
+    </w:lvl>
+    <w:lvl w:ilvl="3" w:tentative="1">
+      <w:start w:val="1"/>
+      <w:numFmt w:val="bullet"/>
+      <w:lvlText w:val=""/>
+      <w:lvlJc w:val="left"/>
+      <w:pPr>
+        <w:tabs>
+          <w:tab w:val="num" w:pos="2880"/>
+        </w:tabs>
+        <w:ind w:left="2880" w:hanging="360"/>
+      </w:pPr>
+      <w:rPr>
+        <w:rFonts w:ascii="Wingdings" w:hAnsi="Wingdings" w:hint="default"/>
+        <w:sz w:val="20"/>
+      </w:rPr>
+    </w:lvl>
+    <w:lvl w:ilvl="4" w:tentative="1">
+      <w:start w:val="1"/>
+      <w:numFmt w:val="bullet"/>
+      <w:lvlText w:val=""/>
+      <w:lvlJc w:val="left"/>
+      <w:pPr>
+        <w:tabs>
+          <w:tab w:val="num" w:pos="3600"/>
+        </w:tabs>
+        <w:ind w:left="3600" w:hanging="360"/>
+      </w:pPr>
+      <w:rPr>
+        <w:rFonts w:ascii="Wingdings" w:hAnsi="Wingdings" w:hint="default"/>
+        <w:sz w:val="20"/>
+      </w:rPr>
+    </w:lvl>
+    <w:lvl w:ilvl="5" w:tentative="1">
+      <w:start w:val="1"/>
+      <w:numFmt w:val="bullet"/>
+      <w:lvlText w:val=""/>
+      <w:lvlJc w:val="left"/>
+      <w:pPr>
+        <w:tabs>
+          <w:tab w:val="num" w:pos="4320"/>
+        </w:tabs>
+        <w:ind w:left="4320" w:hanging="360"/>
+      </w:pPr>
+      <w:rPr>
+        <w:rFonts w:ascii="Wingdings" w:hAnsi="Wingdings" w:hint="default"/>
+        <w:sz w:val="20"/>
+      </w:rPr>
+    </w:lvl>
+    <w:lvl w:ilvl="6" w:tentative="1">
+      <w:start w:val="1"/>
+      <w:numFmt w:val="bullet"/>
+      <w:lvlText w:val=""/>
+      <w:lvlJc w:val="left"/>
+      <w:pPr>
+        <w:tabs>
+          <w:tab w:val="num" w:pos="5040"/>
+        </w:tabs>
+        <w:ind w:left="5040" w:hanging="360"/>
+      </w:pPr>
+      <w:rPr>
+        <w:rFonts w:ascii="Wingdings" w:hAnsi="Wingdings" w:hint="default"/>
+        <w:sz w:val="20"/>
+      </w:rPr>
+    </w:lvl>
+    <w:lvl w:ilvl="7" w:tentative="1">
+      <w:start w:val="1"/>
+      <w:numFmt w:val="bullet"/>
+      <w:lvlText w:val=""/>
+      <w:lvlJc w:val="left"/>
+      <w:pPr>
+        <w:tabs>
+          <w:tab w:val="num" w:pos="5760"/>
+        </w:tabs>
+        <w:ind w:left="5760" w:hanging="360"/>
+      </w:pPr>
+      <w:rPr>
+        <w:rFonts w:ascii="Wingdings" w:hAnsi="Wingdings" w:hint="default"/>
+        <w:sz w:val="20"/>
+      </w:rPr>
+    </w:lvl>
+    <w:lvl w:ilvl="8" w:tentative="1">
+      <w:start w:val="1"/>
+      <w:numFmt w:val="bullet"/>
+      <w:lvlText w:val=""/>
+      <w:lvlJc w:val="left"/>
+      <w:pPr>
+        <w:tabs>
+          <w:tab w:val="num" w:pos="6480"/>
+        </w:tabs>
+        <w:ind w:left="6480" w:hanging="360"/>
+      </w:pPr>
+      <w:rPr>
+        <w:rFonts w:ascii="Wingdings" w:hAnsi="Wingdings" w:hint="default"/>
+        <w:sz w:val="20"/>
+      </w:rPr>
+    </w:lvl>
+  </w:abstractNum>
+  <w:abstractNum w:abstractNumId="3" w15:restartNumberingAfterBreak="0">
     <w:nsid w:val="10CC0EFF"/>
     <w:multiLevelType w:val="multilevel"/>
     <w:tmpl w:val="E2A46302"/>
@@ -2244,7 +4228,7 @@
       </w:pPr>
     </w:lvl>
   </w:abstractNum>
-  <w:abstractNum w:abstractNumId="3" w15:restartNumberingAfterBreak="0">
+  <w:abstractNum w:abstractNumId="4" w15:restartNumberingAfterBreak="0">
     <w:nsid w:val="1133009B"/>
     <w:multiLevelType w:val="multilevel"/>
     <w:tmpl w:val="B308E2E8"/>
@@ -2393,7 +4377,305 @@
       </w:rPr>
     </w:lvl>
   </w:abstractNum>
-  <w:abstractNum w:abstractNumId="4" w15:restartNumberingAfterBreak="0">
+  <w:abstractNum w:abstractNumId="5" w15:restartNumberingAfterBreak="0">
+    <w:nsid w:val="11AB1332"/>
+    <w:multiLevelType w:val="multilevel"/>
+    <w:tmpl w:val="5524BCFC"/>
+    <w:lvl w:ilvl="0">
+      <w:start w:val="1"/>
+      <w:numFmt w:val="bullet"/>
+      <w:lvlText w:val=""/>
+      <w:lvlJc w:val="left"/>
+      <w:pPr>
+        <w:tabs>
+          <w:tab w:val="num" w:pos="720"/>
+        </w:tabs>
+        <w:ind w:left="720" w:hanging="360"/>
+      </w:pPr>
+      <w:rPr>
+        <w:rFonts w:ascii="Symbol" w:hAnsi="Symbol" w:hint="default"/>
+        <w:sz w:val="20"/>
+      </w:rPr>
+    </w:lvl>
+    <w:lvl w:ilvl="1" w:tentative="1">
+      <w:start w:val="1"/>
+      <w:numFmt w:val="bullet"/>
+      <w:lvlText w:val="o"/>
+      <w:lvlJc w:val="left"/>
+      <w:pPr>
+        <w:tabs>
+          <w:tab w:val="num" w:pos="1440"/>
+        </w:tabs>
+        <w:ind w:left="1440" w:hanging="360"/>
+      </w:pPr>
+      <w:rPr>
+        <w:rFonts w:ascii="Courier New" w:hAnsi="Courier New" w:hint="default"/>
+        <w:sz w:val="20"/>
+      </w:rPr>
+    </w:lvl>
+    <w:lvl w:ilvl="2" w:tentative="1">
+      <w:start w:val="1"/>
+      <w:numFmt w:val="bullet"/>
+      <w:lvlText w:val=""/>
+      <w:lvlJc w:val="left"/>
+      <w:pPr>
+        <w:tabs>
+          <w:tab w:val="num" w:pos="2160"/>
+        </w:tabs>
+        <w:ind w:left="2160" w:hanging="360"/>
+      </w:pPr>
+      <w:rPr>
+        <w:rFonts w:ascii="Wingdings" w:hAnsi="Wingdings" w:hint="default"/>
+        <w:sz w:val="20"/>
+      </w:rPr>
+    </w:lvl>
+    <w:lvl w:ilvl="3" w:tentative="1">
+      <w:start w:val="1"/>
+      <w:numFmt w:val="bullet"/>
+      <w:lvlText w:val=""/>
+      <w:lvlJc w:val="left"/>
+      <w:pPr>
+        <w:tabs>
+          <w:tab w:val="num" w:pos="2880"/>
+        </w:tabs>
+        <w:ind w:left="2880" w:hanging="360"/>
+      </w:pPr>
+      <w:rPr>
+        <w:rFonts w:ascii="Wingdings" w:hAnsi="Wingdings" w:hint="default"/>
+        <w:sz w:val="20"/>
+      </w:rPr>
+    </w:lvl>
+    <w:lvl w:ilvl="4" w:tentative="1">
+      <w:start w:val="1"/>
+      <w:numFmt w:val="bullet"/>
+      <w:lvlText w:val=""/>
+      <w:lvlJc w:val="left"/>
+      <w:pPr>
+        <w:tabs>
+          <w:tab w:val="num" w:pos="3600"/>
+        </w:tabs>
+        <w:ind w:left="3600" w:hanging="360"/>
+      </w:pPr>
+      <w:rPr>
+        <w:rFonts w:ascii="Wingdings" w:hAnsi="Wingdings" w:hint="default"/>
+        <w:sz w:val="20"/>
+      </w:rPr>
+    </w:lvl>
+    <w:lvl w:ilvl="5" w:tentative="1">
+      <w:start w:val="1"/>
+      <w:numFmt w:val="bullet"/>
+      <w:lvlText w:val=""/>
+      <w:lvlJc w:val="left"/>
+      <w:pPr>
+        <w:tabs>
+          <w:tab w:val="num" w:pos="4320"/>
+        </w:tabs>
+        <w:ind w:left="4320" w:hanging="360"/>
+      </w:pPr>
+      <w:rPr>
+        <w:rFonts w:ascii="Wingdings" w:hAnsi="Wingdings" w:hint="default"/>
+        <w:sz w:val="20"/>
+      </w:rPr>
+    </w:lvl>
+    <w:lvl w:ilvl="6" w:tentative="1">
+      <w:start w:val="1"/>
+      <w:numFmt w:val="bullet"/>
+      <w:lvlText w:val=""/>
+      <w:lvlJc w:val="left"/>
+      <w:pPr>
+        <w:tabs>
+          <w:tab w:val="num" w:pos="5040"/>
+        </w:tabs>
+        <w:ind w:left="5040" w:hanging="360"/>
+      </w:pPr>
+      <w:rPr>
+        <w:rFonts w:ascii="Wingdings" w:hAnsi="Wingdings" w:hint="default"/>
+        <w:sz w:val="20"/>
+      </w:rPr>
+    </w:lvl>
+    <w:lvl w:ilvl="7" w:tentative="1">
+      <w:start w:val="1"/>
+      <w:numFmt w:val="bullet"/>
+      <w:lvlText w:val=""/>
+      <w:lvlJc w:val="left"/>
+      <w:pPr>
+        <w:tabs>
+          <w:tab w:val="num" w:pos="5760"/>
+        </w:tabs>
+        <w:ind w:left="5760" w:hanging="360"/>
+      </w:pPr>
+      <w:rPr>
+        <w:rFonts w:ascii="Wingdings" w:hAnsi="Wingdings" w:hint="default"/>
+        <w:sz w:val="20"/>
+      </w:rPr>
+    </w:lvl>
+    <w:lvl w:ilvl="8" w:tentative="1">
+      <w:start w:val="1"/>
+      <w:numFmt w:val="bullet"/>
+      <w:lvlText w:val=""/>
+      <w:lvlJc w:val="left"/>
+      <w:pPr>
+        <w:tabs>
+          <w:tab w:val="num" w:pos="6480"/>
+        </w:tabs>
+        <w:ind w:left="6480" w:hanging="360"/>
+      </w:pPr>
+      <w:rPr>
+        <w:rFonts w:ascii="Wingdings" w:hAnsi="Wingdings" w:hint="default"/>
+        <w:sz w:val="20"/>
+      </w:rPr>
+    </w:lvl>
+  </w:abstractNum>
+  <w:abstractNum w:abstractNumId="6" w15:restartNumberingAfterBreak="0">
+    <w:nsid w:val="17930894"/>
+    <w:multiLevelType w:val="multilevel"/>
+    <w:tmpl w:val="9EF46DDA"/>
+    <w:lvl w:ilvl="0">
+      <w:start w:val="1"/>
+      <w:numFmt w:val="bullet"/>
+      <w:lvlText w:val=""/>
+      <w:lvlJc w:val="left"/>
+      <w:pPr>
+        <w:tabs>
+          <w:tab w:val="num" w:pos="720"/>
+        </w:tabs>
+        <w:ind w:left="720" w:hanging="360"/>
+      </w:pPr>
+      <w:rPr>
+        <w:rFonts w:ascii="Symbol" w:hAnsi="Symbol" w:hint="default"/>
+        <w:sz w:val="20"/>
+      </w:rPr>
+    </w:lvl>
+    <w:lvl w:ilvl="1">
+      <w:start w:val="1"/>
+      <w:numFmt w:val="bullet"/>
+      <w:lvlText w:val="o"/>
+      <w:lvlJc w:val="left"/>
+      <w:pPr>
+        <w:tabs>
+          <w:tab w:val="num" w:pos="1440"/>
+        </w:tabs>
+        <w:ind w:left="1440" w:hanging="360"/>
+      </w:pPr>
+      <w:rPr>
+        <w:rFonts w:ascii="Courier New" w:hAnsi="Courier New" w:hint="default"/>
+        <w:sz w:val="20"/>
+      </w:rPr>
+    </w:lvl>
+    <w:lvl w:ilvl="2" w:tentative="1">
+      <w:start w:val="1"/>
+      <w:numFmt w:val="bullet"/>
+      <w:lvlText w:val=""/>
+      <w:lvlJc w:val="left"/>
+      <w:pPr>
+        <w:tabs>
+          <w:tab w:val="num" w:pos="2160"/>
+        </w:tabs>
+        <w:ind w:left="2160" w:hanging="360"/>
+      </w:pPr>
+      <w:rPr>
+        <w:rFonts w:ascii="Wingdings" w:hAnsi="Wingdings" w:hint="default"/>
+        <w:sz w:val="20"/>
+      </w:rPr>
+    </w:lvl>
+    <w:lvl w:ilvl="3" w:tentative="1">
+      <w:start w:val="1"/>
+      <w:numFmt w:val="bullet"/>
+      <w:lvlText w:val=""/>
+      <w:lvlJc w:val="left"/>
+      <w:pPr>
+        <w:tabs>
+          <w:tab w:val="num" w:pos="2880"/>
+        </w:tabs>
+        <w:ind w:left="2880" w:hanging="360"/>
+      </w:pPr>
+      <w:rPr>
+        <w:rFonts w:ascii="Wingdings" w:hAnsi="Wingdings" w:hint="default"/>
+        <w:sz w:val="20"/>
+      </w:rPr>
+    </w:lvl>
+    <w:lvl w:ilvl="4" w:tentative="1">
+      <w:start w:val="1"/>
+      <w:numFmt w:val="bullet"/>
+      <w:lvlText w:val=""/>
+      <w:lvlJc w:val="left"/>
+      <w:pPr>
+        <w:tabs>
+          <w:tab w:val="num" w:pos="3600"/>
+        </w:tabs>
+        <w:ind w:left="3600" w:hanging="360"/>
+      </w:pPr>
+      <w:rPr>
+        <w:rFonts w:ascii="Wingdings" w:hAnsi="Wingdings" w:hint="default"/>
+        <w:sz w:val="20"/>
+      </w:rPr>
+    </w:lvl>
+    <w:lvl w:ilvl="5" w:tentative="1">
+      <w:start w:val="1"/>
+      <w:numFmt w:val="bullet"/>
+      <w:lvlText w:val=""/>
+      <w:lvlJc w:val="left"/>
+      <w:pPr>
+        <w:tabs>
+          <w:tab w:val="num" w:pos="4320"/>
+        </w:tabs>
+        <w:ind w:left="4320" w:hanging="360"/>
+      </w:pPr>
+      <w:rPr>
+        <w:rFonts w:ascii="Wingdings" w:hAnsi="Wingdings" w:hint="default"/>
+        <w:sz w:val="20"/>
+      </w:rPr>
+    </w:lvl>
+    <w:lvl w:ilvl="6" w:tentative="1">
+      <w:start w:val="1"/>
+      <w:numFmt w:val="bullet"/>
+      <w:lvlText w:val=""/>
+      <w:lvlJc w:val="left"/>
+      <w:pPr>
+        <w:tabs>
+          <w:tab w:val="num" w:pos="5040"/>
+        </w:tabs>
+        <w:ind w:left="5040" w:hanging="360"/>
+      </w:pPr>
+      <w:rPr>
+        <w:rFonts w:ascii="Wingdings" w:hAnsi="Wingdings" w:hint="default"/>
+        <w:sz w:val="20"/>
+      </w:rPr>
+    </w:lvl>
+    <w:lvl w:ilvl="7" w:tentative="1">
+      <w:start w:val="1"/>
+      <w:numFmt w:val="bullet"/>
+      <w:lvlText w:val=""/>
+      <w:lvlJc w:val="left"/>
+      <w:pPr>
+        <w:tabs>
+          <w:tab w:val="num" w:pos="5760"/>
+        </w:tabs>
+        <w:ind w:left="5760" w:hanging="360"/>
+      </w:pPr>
+      <w:rPr>
+        <w:rFonts w:ascii="Wingdings" w:hAnsi="Wingdings" w:hint="default"/>
+        <w:sz w:val="20"/>
+      </w:rPr>
+    </w:lvl>
+    <w:lvl w:ilvl="8" w:tentative="1">
+      <w:start w:val="1"/>
+      <w:numFmt w:val="bullet"/>
+      <w:lvlText w:val=""/>
+      <w:lvlJc w:val="left"/>
+      <w:pPr>
+        <w:tabs>
+          <w:tab w:val="num" w:pos="6480"/>
+        </w:tabs>
+        <w:ind w:left="6480" w:hanging="360"/>
+      </w:pPr>
+      <w:rPr>
+        <w:rFonts w:ascii="Wingdings" w:hAnsi="Wingdings" w:hint="default"/>
+        <w:sz w:val="20"/>
+      </w:rPr>
+    </w:lvl>
+  </w:abstractNum>
+  <w:abstractNum w:abstractNumId="7" w15:restartNumberingAfterBreak="0">
     <w:nsid w:val="19D41D67"/>
     <w:multiLevelType w:val="multilevel"/>
     <w:tmpl w:val="4BBA90B4"/>
@@ -2542,7 +4824,7 @@
       </w:rPr>
     </w:lvl>
   </w:abstractNum>
-  <w:abstractNum w:abstractNumId="5" w15:restartNumberingAfterBreak="0">
+  <w:abstractNum w:abstractNumId="8" w15:restartNumberingAfterBreak="0">
     <w:nsid w:val="1A347D48"/>
     <w:multiLevelType w:val="multilevel"/>
     <w:tmpl w:val="1C483B62"/>
@@ -2691,7 +4973,7 @@
       </w:rPr>
     </w:lvl>
   </w:abstractNum>
-  <w:abstractNum w:abstractNumId="6" w15:restartNumberingAfterBreak="0">
+  <w:abstractNum w:abstractNumId="9" w15:restartNumberingAfterBreak="0">
     <w:nsid w:val="1DDC286C"/>
     <w:multiLevelType w:val="multilevel"/>
     <w:tmpl w:val="E2429248"/>
@@ -2840,7 +5122,305 @@
       </w:rPr>
     </w:lvl>
   </w:abstractNum>
-  <w:abstractNum w:abstractNumId="7" w15:restartNumberingAfterBreak="0">
+  <w:abstractNum w:abstractNumId="10" w15:restartNumberingAfterBreak="0">
+    <w:nsid w:val="1F5F3FBA"/>
+    <w:multiLevelType w:val="multilevel"/>
+    <w:tmpl w:val="2108AF28"/>
+    <w:lvl w:ilvl="0">
+      <w:start w:val="1"/>
+      <w:numFmt w:val="bullet"/>
+      <w:lvlText w:val=""/>
+      <w:lvlJc w:val="left"/>
+      <w:pPr>
+        <w:tabs>
+          <w:tab w:val="num" w:pos="720"/>
+        </w:tabs>
+        <w:ind w:left="720" w:hanging="360"/>
+      </w:pPr>
+      <w:rPr>
+        <w:rFonts w:ascii="Symbol" w:hAnsi="Symbol" w:hint="default"/>
+        <w:sz w:val="20"/>
+      </w:rPr>
+    </w:lvl>
+    <w:lvl w:ilvl="1">
+      <w:start w:val="1"/>
+      <w:numFmt w:val="bullet"/>
+      <w:lvlText w:val="o"/>
+      <w:lvlJc w:val="left"/>
+      <w:pPr>
+        <w:tabs>
+          <w:tab w:val="num" w:pos="1440"/>
+        </w:tabs>
+        <w:ind w:left="1440" w:hanging="360"/>
+      </w:pPr>
+      <w:rPr>
+        <w:rFonts w:ascii="Courier New" w:hAnsi="Courier New" w:hint="default"/>
+        <w:sz w:val="20"/>
+      </w:rPr>
+    </w:lvl>
+    <w:lvl w:ilvl="2" w:tentative="1">
+      <w:start w:val="1"/>
+      <w:numFmt w:val="bullet"/>
+      <w:lvlText w:val=""/>
+      <w:lvlJc w:val="left"/>
+      <w:pPr>
+        <w:tabs>
+          <w:tab w:val="num" w:pos="2160"/>
+        </w:tabs>
+        <w:ind w:left="2160" w:hanging="360"/>
+      </w:pPr>
+      <w:rPr>
+        <w:rFonts w:ascii="Wingdings" w:hAnsi="Wingdings" w:hint="default"/>
+        <w:sz w:val="20"/>
+      </w:rPr>
+    </w:lvl>
+    <w:lvl w:ilvl="3" w:tentative="1">
+      <w:start w:val="1"/>
+      <w:numFmt w:val="bullet"/>
+      <w:lvlText w:val=""/>
+      <w:lvlJc w:val="left"/>
+      <w:pPr>
+        <w:tabs>
+          <w:tab w:val="num" w:pos="2880"/>
+        </w:tabs>
+        <w:ind w:left="2880" w:hanging="360"/>
+      </w:pPr>
+      <w:rPr>
+        <w:rFonts w:ascii="Wingdings" w:hAnsi="Wingdings" w:hint="default"/>
+        <w:sz w:val="20"/>
+      </w:rPr>
+    </w:lvl>
+    <w:lvl w:ilvl="4" w:tentative="1">
+      <w:start w:val="1"/>
+      <w:numFmt w:val="bullet"/>
+      <w:lvlText w:val=""/>
+      <w:lvlJc w:val="left"/>
+      <w:pPr>
+        <w:tabs>
+          <w:tab w:val="num" w:pos="3600"/>
+        </w:tabs>
+        <w:ind w:left="3600" w:hanging="360"/>
+      </w:pPr>
+      <w:rPr>
+        <w:rFonts w:ascii="Wingdings" w:hAnsi="Wingdings" w:hint="default"/>
+        <w:sz w:val="20"/>
+      </w:rPr>
+    </w:lvl>
+    <w:lvl w:ilvl="5" w:tentative="1">
+      <w:start w:val="1"/>
+      <w:numFmt w:val="bullet"/>
+      <w:lvlText w:val=""/>
+      <w:lvlJc w:val="left"/>
+      <w:pPr>
+        <w:tabs>
+          <w:tab w:val="num" w:pos="4320"/>
+        </w:tabs>
+        <w:ind w:left="4320" w:hanging="360"/>
+      </w:pPr>
+      <w:rPr>
+        <w:rFonts w:ascii="Wingdings" w:hAnsi="Wingdings" w:hint="default"/>
+        <w:sz w:val="20"/>
+      </w:rPr>
+    </w:lvl>
+    <w:lvl w:ilvl="6" w:tentative="1">
+      <w:start w:val="1"/>
+      <w:numFmt w:val="bullet"/>
+      <w:lvlText w:val=""/>
+      <w:lvlJc w:val="left"/>
+      <w:pPr>
+        <w:tabs>
+          <w:tab w:val="num" w:pos="5040"/>
+        </w:tabs>
+        <w:ind w:left="5040" w:hanging="360"/>
+      </w:pPr>
+      <w:rPr>
+        <w:rFonts w:ascii="Wingdings" w:hAnsi="Wingdings" w:hint="default"/>
+        <w:sz w:val="20"/>
+      </w:rPr>
+    </w:lvl>
+    <w:lvl w:ilvl="7" w:tentative="1">
+      <w:start w:val="1"/>
+      <w:numFmt w:val="bullet"/>
+      <w:lvlText w:val=""/>
+      <w:lvlJc w:val="left"/>
+      <w:pPr>
+        <w:tabs>
+          <w:tab w:val="num" w:pos="5760"/>
+        </w:tabs>
+        <w:ind w:left="5760" w:hanging="360"/>
+      </w:pPr>
+      <w:rPr>
+        <w:rFonts w:ascii="Wingdings" w:hAnsi="Wingdings" w:hint="default"/>
+        <w:sz w:val="20"/>
+      </w:rPr>
+    </w:lvl>
+    <w:lvl w:ilvl="8" w:tentative="1">
+      <w:start w:val="1"/>
+      <w:numFmt w:val="bullet"/>
+      <w:lvlText w:val=""/>
+      <w:lvlJc w:val="left"/>
+      <w:pPr>
+        <w:tabs>
+          <w:tab w:val="num" w:pos="6480"/>
+        </w:tabs>
+        <w:ind w:left="6480" w:hanging="360"/>
+      </w:pPr>
+      <w:rPr>
+        <w:rFonts w:ascii="Wingdings" w:hAnsi="Wingdings" w:hint="default"/>
+        <w:sz w:val="20"/>
+      </w:rPr>
+    </w:lvl>
+  </w:abstractNum>
+  <w:abstractNum w:abstractNumId="11" w15:restartNumberingAfterBreak="0">
+    <w:nsid w:val="23900205"/>
+    <w:multiLevelType w:val="multilevel"/>
+    <w:tmpl w:val="497CA4AA"/>
+    <w:lvl w:ilvl="0">
+      <w:start w:val="1"/>
+      <w:numFmt w:val="bullet"/>
+      <w:lvlText w:val=""/>
+      <w:lvlJc w:val="left"/>
+      <w:pPr>
+        <w:tabs>
+          <w:tab w:val="num" w:pos="720"/>
+        </w:tabs>
+        <w:ind w:left="720" w:hanging="360"/>
+      </w:pPr>
+      <w:rPr>
+        <w:rFonts w:ascii="Symbol" w:hAnsi="Symbol" w:hint="default"/>
+        <w:sz w:val="20"/>
+      </w:rPr>
+    </w:lvl>
+    <w:lvl w:ilvl="1" w:tentative="1">
+      <w:start w:val="1"/>
+      <w:numFmt w:val="bullet"/>
+      <w:lvlText w:val="o"/>
+      <w:lvlJc w:val="left"/>
+      <w:pPr>
+        <w:tabs>
+          <w:tab w:val="num" w:pos="1440"/>
+        </w:tabs>
+        <w:ind w:left="1440" w:hanging="360"/>
+      </w:pPr>
+      <w:rPr>
+        <w:rFonts w:ascii="Courier New" w:hAnsi="Courier New" w:hint="default"/>
+        <w:sz w:val="20"/>
+      </w:rPr>
+    </w:lvl>
+    <w:lvl w:ilvl="2" w:tentative="1">
+      <w:start w:val="1"/>
+      <w:numFmt w:val="bullet"/>
+      <w:lvlText w:val=""/>
+      <w:lvlJc w:val="left"/>
+      <w:pPr>
+        <w:tabs>
+          <w:tab w:val="num" w:pos="2160"/>
+        </w:tabs>
+        <w:ind w:left="2160" w:hanging="360"/>
+      </w:pPr>
+      <w:rPr>
+        <w:rFonts w:ascii="Wingdings" w:hAnsi="Wingdings" w:hint="default"/>
+        <w:sz w:val="20"/>
+      </w:rPr>
+    </w:lvl>
+    <w:lvl w:ilvl="3" w:tentative="1">
+      <w:start w:val="1"/>
+      <w:numFmt w:val="bullet"/>
+      <w:lvlText w:val=""/>
+      <w:lvlJc w:val="left"/>
+      <w:pPr>
+        <w:tabs>
+          <w:tab w:val="num" w:pos="2880"/>
+        </w:tabs>
+        <w:ind w:left="2880" w:hanging="360"/>
+      </w:pPr>
+      <w:rPr>
+        <w:rFonts w:ascii="Wingdings" w:hAnsi="Wingdings" w:hint="default"/>
+        <w:sz w:val="20"/>
+      </w:rPr>
+    </w:lvl>
+    <w:lvl w:ilvl="4" w:tentative="1">
+      <w:start w:val="1"/>
+      <w:numFmt w:val="bullet"/>
+      <w:lvlText w:val=""/>
+      <w:lvlJc w:val="left"/>
+      <w:pPr>
+        <w:tabs>
+          <w:tab w:val="num" w:pos="3600"/>
+        </w:tabs>
+        <w:ind w:left="3600" w:hanging="360"/>
+      </w:pPr>
+      <w:rPr>
+        <w:rFonts w:ascii="Wingdings" w:hAnsi="Wingdings" w:hint="default"/>
+        <w:sz w:val="20"/>
+      </w:rPr>
+    </w:lvl>
+    <w:lvl w:ilvl="5" w:tentative="1">
+      <w:start w:val="1"/>
+      <w:numFmt w:val="bullet"/>
+      <w:lvlText w:val=""/>
+      <w:lvlJc w:val="left"/>
+      <w:pPr>
+        <w:tabs>
+          <w:tab w:val="num" w:pos="4320"/>
+        </w:tabs>
+        <w:ind w:left="4320" w:hanging="360"/>
+      </w:pPr>
+      <w:rPr>
+        <w:rFonts w:ascii="Wingdings" w:hAnsi="Wingdings" w:hint="default"/>
+        <w:sz w:val="20"/>
+      </w:rPr>
+    </w:lvl>
+    <w:lvl w:ilvl="6" w:tentative="1">
+      <w:start w:val="1"/>
+      <w:numFmt w:val="bullet"/>
+      <w:lvlText w:val=""/>
+      <w:lvlJc w:val="left"/>
+      <w:pPr>
+        <w:tabs>
+          <w:tab w:val="num" w:pos="5040"/>
+        </w:tabs>
+        <w:ind w:left="5040" w:hanging="360"/>
+      </w:pPr>
+      <w:rPr>
+        <w:rFonts w:ascii="Wingdings" w:hAnsi="Wingdings" w:hint="default"/>
+        <w:sz w:val="20"/>
+      </w:rPr>
+    </w:lvl>
+    <w:lvl w:ilvl="7" w:tentative="1">
+      <w:start w:val="1"/>
+      <w:numFmt w:val="bullet"/>
+      <w:lvlText w:val=""/>
+      <w:lvlJc w:val="left"/>
+      <w:pPr>
+        <w:tabs>
+          <w:tab w:val="num" w:pos="5760"/>
+        </w:tabs>
+        <w:ind w:left="5760" w:hanging="360"/>
+      </w:pPr>
+      <w:rPr>
+        <w:rFonts w:ascii="Wingdings" w:hAnsi="Wingdings" w:hint="default"/>
+        <w:sz w:val="20"/>
+      </w:rPr>
+    </w:lvl>
+    <w:lvl w:ilvl="8" w:tentative="1">
+      <w:start w:val="1"/>
+      <w:numFmt w:val="bullet"/>
+      <w:lvlText w:val=""/>
+      <w:lvlJc w:val="left"/>
+      <w:pPr>
+        <w:tabs>
+          <w:tab w:val="num" w:pos="6480"/>
+        </w:tabs>
+        <w:ind w:left="6480" w:hanging="360"/>
+      </w:pPr>
+      <w:rPr>
+        <w:rFonts w:ascii="Wingdings" w:hAnsi="Wingdings" w:hint="default"/>
+        <w:sz w:val="20"/>
+      </w:rPr>
+    </w:lvl>
+  </w:abstractNum>
+  <w:abstractNum w:abstractNumId="12" w15:restartNumberingAfterBreak="0">
     <w:nsid w:val="24FA52B9"/>
     <w:multiLevelType w:val="multilevel"/>
     <w:tmpl w:val="B9C2EA4A"/>
@@ -2989,7 +5569,7 @@
       </w:rPr>
     </w:lvl>
   </w:abstractNum>
-  <w:abstractNum w:abstractNumId="8" w15:restartNumberingAfterBreak="0">
+  <w:abstractNum w:abstractNumId="13" w15:restartNumberingAfterBreak="0">
     <w:nsid w:val="3A4C282B"/>
     <w:multiLevelType w:val="multilevel"/>
     <w:tmpl w:val="7160DBE0"/>
@@ -3138,7 +5718,156 @@
       </w:rPr>
     </w:lvl>
   </w:abstractNum>
-  <w:abstractNum w:abstractNumId="9" w15:restartNumberingAfterBreak="0">
+  <w:abstractNum w:abstractNumId="14" w15:restartNumberingAfterBreak="0">
+    <w:nsid w:val="3DE82B00"/>
+    <w:multiLevelType w:val="multilevel"/>
+    <w:tmpl w:val="C3DA03E4"/>
+    <w:lvl w:ilvl="0">
+      <w:start w:val="1"/>
+      <w:numFmt w:val="bullet"/>
+      <w:lvlText w:val=""/>
+      <w:lvlJc w:val="left"/>
+      <w:pPr>
+        <w:tabs>
+          <w:tab w:val="num" w:pos="1080"/>
+        </w:tabs>
+        <w:ind w:left="1080" w:hanging="360"/>
+      </w:pPr>
+      <w:rPr>
+        <w:rFonts w:ascii="Wingdings" w:hAnsi="Wingdings" w:hint="default"/>
+        <w:sz w:val="20"/>
+      </w:rPr>
+    </w:lvl>
+    <w:lvl w:ilvl="1" w:tentative="1">
+      <w:start w:val="1"/>
+      <w:numFmt w:val="bullet"/>
+      <w:lvlText w:val="o"/>
+      <w:lvlJc w:val="left"/>
+      <w:pPr>
+        <w:tabs>
+          <w:tab w:val="num" w:pos="1800"/>
+        </w:tabs>
+        <w:ind w:left="1800" w:hanging="360"/>
+      </w:pPr>
+      <w:rPr>
+        <w:rFonts w:ascii="Courier New" w:hAnsi="Courier New" w:hint="default"/>
+        <w:sz w:val="20"/>
+      </w:rPr>
+    </w:lvl>
+    <w:lvl w:ilvl="2" w:tentative="1">
+      <w:start w:val="1"/>
+      <w:numFmt w:val="bullet"/>
+      <w:lvlText w:val=""/>
+      <w:lvlJc w:val="left"/>
+      <w:pPr>
+        <w:tabs>
+          <w:tab w:val="num" w:pos="2520"/>
+        </w:tabs>
+        <w:ind w:left="2520" w:hanging="360"/>
+      </w:pPr>
+      <w:rPr>
+        <w:rFonts w:ascii="Wingdings" w:hAnsi="Wingdings" w:hint="default"/>
+        <w:sz w:val="20"/>
+      </w:rPr>
+    </w:lvl>
+    <w:lvl w:ilvl="3" w:tentative="1">
+      <w:start w:val="1"/>
+      <w:numFmt w:val="bullet"/>
+      <w:lvlText w:val=""/>
+      <w:lvlJc w:val="left"/>
+      <w:pPr>
+        <w:tabs>
+          <w:tab w:val="num" w:pos="3240"/>
+        </w:tabs>
+        <w:ind w:left="3240" w:hanging="360"/>
+      </w:pPr>
+      <w:rPr>
+        <w:rFonts w:ascii="Wingdings" w:hAnsi="Wingdings" w:hint="default"/>
+        <w:sz w:val="20"/>
+      </w:rPr>
+    </w:lvl>
+    <w:lvl w:ilvl="4" w:tentative="1">
+      <w:start w:val="1"/>
+      <w:numFmt w:val="bullet"/>
+      <w:lvlText w:val=""/>
+      <w:lvlJc w:val="left"/>
+      <w:pPr>
+        <w:tabs>
+          <w:tab w:val="num" w:pos="3960"/>
+        </w:tabs>
+        <w:ind w:left="3960" w:hanging="360"/>
+      </w:pPr>
+      <w:rPr>
+        <w:rFonts w:ascii="Wingdings" w:hAnsi="Wingdings" w:hint="default"/>
+        <w:sz w:val="20"/>
+      </w:rPr>
+    </w:lvl>
+    <w:lvl w:ilvl="5" w:tentative="1">
+      <w:start w:val="1"/>
+      <w:numFmt w:val="bullet"/>
+      <w:lvlText w:val=""/>
+      <w:lvlJc w:val="left"/>
+      <w:pPr>
+        <w:tabs>
+          <w:tab w:val="num" w:pos="4680"/>
+        </w:tabs>
+        <w:ind w:left="4680" w:hanging="360"/>
+      </w:pPr>
+      <w:rPr>
+        <w:rFonts w:ascii="Wingdings" w:hAnsi="Wingdings" w:hint="default"/>
+        <w:sz w:val="20"/>
+      </w:rPr>
+    </w:lvl>
+    <w:lvl w:ilvl="6" w:tentative="1">
+      <w:start w:val="1"/>
+      <w:numFmt w:val="bullet"/>
+      <w:lvlText w:val=""/>
+      <w:lvlJc w:val="left"/>
+      <w:pPr>
+        <w:tabs>
+          <w:tab w:val="num" w:pos="5400"/>
+        </w:tabs>
+        <w:ind w:left="5400" w:hanging="360"/>
+      </w:pPr>
+      <w:rPr>
+        <w:rFonts w:ascii="Wingdings" w:hAnsi="Wingdings" w:hint="default"/>
+        <w:sz w:val="20"/>
+      </w:rPr>
+    </w:lvl>
+    <w:lvl w:ilvl="7" w:tentative="1">
+      <w:start w:val="1"/>
+      <w:numFmt w:val="bullet"/>
+      <w:lvlText w:val=""/>
+      <w:lvlJc w:val="left"/>
+      <w:pPr>
+        <w:tabs>
+          <w:tab w:val="num" w:pos="6120"/>
+        </w:tabs>
+        <w:ind w:left="6120" w:hanging="360"/>
+      </w:pPr>
+      <w:rPr>
+        <w:rFonts w:ascii="Wingdings" w:hAnsi="Wingdings" w:hint="default"/>
+        <w:sz w:val="20"/>
+      </w:rPr>
+    </w:lvl>
+    <w:lvl w:ilvl="8" w:tentative="1">
+      <w:start w:val="1"/>
+      <w:numFmt w:val="bullet"/>
+      <w:lvlText w:val=""/>
+      <w:lvlJc w:val="left"/>
+      <w:pPr>
+        <w:tabs>
+          <w:tab w:val="num" w:pos="6840"/>
+        </w:tabs>
+        <w:ind w:left="6840" w:hanging="360"/>
+      </w:pPr>
+      <w:rPr>
+        <w:rFonts w:ascii="Wingdings" w:hAnsi="Wingdings" w:hint="default"/>
+        <w:sz w:val="20"/>
+      </w:rPr>
+    </w:lvl>
+  </w:abstractNum>
+  <w:abstractNum w:abstractNumId="15" w15:restartNumberingAfterBreak="0">
     <w:nsid w:val="407B76BD"/>
     <w:multiLevelType w:val="multilevel"/>
     <w:tmpl w:val="FC8ABE90"/>
@@ -3287,7 +6016,7 @@
       </w:rPr>
     </w:lvl>
   </w:abstractNum>
-  <w:abstractNum w:abstractNumId="10" w15:restartNumberingAfterBreak="0">
+  <w:abstractNum w:abstractNumId="16" w15:restartNumberingAfterBreak="0">
     <w:nsid w:val="40D32F3C"/>
     <w:multiLevelType w:val="multilevel"/>
     <w:tmpl w:val="A3A6994E"/>
@@ -3436,7 +6165,7 @@
       </w:rPr>
     </w:lvl>
   </w:abstractNum>
-  <w:abstractNum w:abstractNumId="11" w15:restartNumberingAfterBreak="0">
+  <w:abstractNum w:abstractNumId="17" w15:restartNumberingAfterBreak="0">
     <w:nsid w:val="419530B6"/>
     <w:multiLevelType w:val="multilevel"/>
     <w:tmpl w:val="E3FE3A3C"/>
@@ -3585,7 +6314,7 @@
       </w:rPr>
     </w:lvl>
   </w:abstractNum>
-  <w:abstractNum w:abstractNumId="12" w15:restartNumberingAfterBreak="0">
+  <w:abstractNum w:abstractNumId="18" w15:restartNumberingAfterBreak="0">
     <w:nsid w:val="485B0257"/>
     <w:multiLevelType w:val="multilevel"/>
     <w:tmpl w:val="EB280B92"/>
@@ -3734,7 +6463,305 @@
       </w:rPr>
     </w:lvl>
   </w:abstractNum>
-  <w:abstractNum w:abstractNumId="13" w15:restartNumberingAfterBreak="0">
+  <w:abstractNum w:abstractNumId="19" w15:restartNumberingAfterBreak="0">
+    <w:nsid w:val="4B9713BF"/>
+    <w:multiLevelType w:val="multilevel"/>
+    <w:tmpl w:val="7372459C"/>
+    <w:lvl w:ilvl="0">
+      <w:start w:val="1"/>
+      <w:numFmt w:val="bullet"/>
+      <w:lvlText w:val=""/>
+      <w:lvlJc w:val="left"/>
+      <w:pPr>
+        <w:tabs>
+          <w:tab w:val="num" w:pos="720"/>
+        </w:tabs>
+        <w:ind w:left="720" w:hanging="360"/>
+      </w:pPr>
+      <w:rPr>
+        <w:rFonts w:ascii="Symbol" w:hAnsi="Symbol" w:hint="default"/>
+        <w:sz w:val="20"/>
+      </w:rPr>
+    </w:lvl>
+    <w:lvl w:ilvl="1">
+      <w:start w:val="1"/>
+      <w:numFmt w:val="bullet"/>
+      <w:lvlText w:val="o"/>
+      <w:lvlJc w:val="left"/>
+      <w:pPr>
+        <w:tabs>
+          <w:tab w:val="num" w:pos="1440"/>
+        </w:tabs>
+        <w:ind w:left="1440" w:hanging="360"/>
+      </w:pPr>
+      <w:rPr>
+        <w:rFonts w:ascii="Courier New" w:hAnsi="Courier New" w:hint="default"/>
+        <w:sz w:val="20"/>
+      </w:rPr>
+    </w:lvl>
+    <w:lvl w:ilvl="2" w:tentative="1">
+      <w:start w:val="1"/>
+      <w:numFmt w:val="bullet"/>
+      <w:lvlText w:val=""/>
+      <w:lvlJc w:val="left"/>
+      <w:pPr>
+        <w:tabs>
+          <w:tab w:val="num" w:pos="2160"/>
+        </w:tabs>
+        <w:ind w:left="2160" w:hanging="360"/>
+      </w:pPr>
+      <w:rPr>
+        <w:rFonts w:ascii="Wingdings" w:hAnsi="Wingdings" w:hint="default"/>
+        <w:sz w:val="20"/>
+      </w:rPr>
+    </w:lvl>
+    <w:lvl w:ilvl="3" w:tentative="1">
+      <w:start w:val="1"/>
+      <w:numFmt w:val="bullet"/>
+      <w:lvlText w:val=""/>
+      <w:lvlJc w:val="left"/>
+      <w:pPr>
+        <w:tabs>
+          <w:tab w:val="num" w:pos="2880"/>
+        </w:tabs>
+        <w:ind w:left="2880" w:hanging="360"/>
+      </w:pPr>
+      <w:rPr>
+        <w:rFonts w:ascii="Wingdings" w:hAnsi="Wingdings" w:hint="default"/>
+        <w:sz w:val="20"/>
+      </w:rPr>
+    </w:lvl>
+    <w:lvl w:ilvl="4" w:tentative="1">
+      <w:start w:val="1"/>
+      <w:numFmt w:val="bullet"/>
+      <w:lvlText w:val=""/>
+      <w:lvlJc w:val="left"/>
+      <w:pPr>
+        <w:tabs>
+          <w:tab w:val="num" w:pos="3600"/>
+        </w:tabs>
+        <w:ind w:left="3600" w:hanging="360"/>
+      </w:pPr>
+      <w:rPr>
+        <w:rFonts w:ascii="Wingdings" w:hAnsi="Wingdings" w:hint="default"/>
+        <w:sz w:val="20"/>
+      </w:rPr>
+    </w:lvl>
+    <w:lvl w:ilvl="5" w:tentative="1">
+      <w:start w:val="1"/>
+      <w:numFmt w:val="bullet"/>
+      <w:lvlText w:val=""/>
+      <w:lvlJc w:val="left"/>
+      <w:pPr>
+        <w:tabs>
+          <w:tab w:val="num" w:pos="4320"/>
+        </w:tabs>
+        <w:ind w:left="4320" w:hanging="360"/>
+      </w:pPr>
+      <w:rPr>
+        <w:rFonts w:ascii="Wingdings" w:hAnsi="Wingdings" w:hint="default"/>
+        <w:sz w:val="20"/>
+      </w:rPr>
+    </w:lvl>
+    <w:lvl w:ilvl="6" w:tentative="1">
+      <w:start w:val="1"/>
+      <w:numFmt w:val="bullet"/>
+      <w:lvlText w:val=""/>
+      <w:lvlJc w:val="left"/>
+      <w:pPr>
+        <w:tabs>
+          <w:tab w:val="num" w:pos="5040"/>
+        </w:tabs>
+        <w:ind w:left="5040" w:hanging="360"/>
+      </w:pPr>
+      <w:rPr>
+        <w:rFonts w:ascii="Wingdings" w:hAnsi="Wingdings" w:hint="default"/>
+        <w:sz w:val="20"/>
+      </w:rPr>
+    </w:lvl>
+    <w:lvl w:ilvl="7" w:tentative="1">
+      <w:start w:val="1"/>
+      <w:numFmt w:val="bullet"/>
+      <w:lvlText w:val=""/>
+      <w:lvlJc w:val="left"/>
+      <w:pPr>
+        <w:tabs>
+          <w:tab w:val="num" w:pos="5760"/>
+        </w:tabs>
+        <w:ind w:left="5760" w:hanging="360"/>
+      </w:pPr>
+      <w:rPr>
+        <w:rFonts w:ascii="Wingdings" w:hAnsi="Wingdings" w:hint="default"/>
+        <w:sz w:val="20"/>
+      </w:rPr>
+    </w:lvl>
+    <w:lvl w:ilvl="8" w:tentative="1">
+      <w:start w:val="1"/>
+      <w:numFmt w:val="bullet"/>
+      <w:lvlText w:val=""/>
+      <w:lvlJc w:val="left"/>
+      <w:pPr>
+        <w:tabs>
+          <w:tab w:val="num" w:pos="6480"/>
+        </w:tabs>
+        <w:ind w:left="6480" w:hanging="360"/>
+      </w:pPr>
+      <w:rPr>
+        <w:rFonts w:ascii="Wingdings" w:hAnsi="Wingdings" w:hint="default"/>
+        <w:sz w:val="20"/>
+      </w:rPr>
+    </w:lvl>
+  </w:abstractNum>
+  <w:abstractNum w:abstractNumId="20" w15:restartNumberingAfterBreak="0">
+    <w:nsid w:val="4DB84A00"/>
+    <w:multiLevelType w:val="multilevel"/>
+    <w:tmpl w:val="3D4CE5B6"/>
+    <w:lvl w:ilvl="0">
+      <w:start w:val="1"/>
+      <w:numFmt w:val="bullet"/>
+      <w:lvlText w:val=""/>
+      <w:lvlJc w:val="left"/>
+      <w:pPr>
+        <w:tabs>
+          <w:tab w:val="num" w:pos="720"/>
+        </w:tabs>
+        <w:ind w:left="720" w:hanging="360"/>
+      </w:pPr>
+      <w:rPr>
+        <w:rFonts w:ascii="Symbol" w:hAnsi="Symbol" w:hint="default"/>
+        <w:sz w:val="20"/>
+      </w:rPr>
+    </w:lvl>
+    <w:lvl w:ilvl="1" w:tentative="1">
+      <w:start w:val="1"/>
+      <w:numFmt w:val="bullet"/>
+      <w:lvlText w:val="o"/>
+      <w:lvlJc w:val="left"/>
+      <w:pPr>
+        <w:tabs>
+          <w:tab w:val="num" w:pos="1440"/>
+        </w:tabs>
+        <w:ind w:left="1440" w:hanging="360"/>
+      </w:pPr>
+      <w:rPr>
+        <w:rFonts w:ascii="Courier New" w:hAnsi="Courier New" w:hint="default"/>
+        <w:sz w:val="20"/>
+      </w:rPr>
+    </w:lvl>
+    <w:lvl w:ilvl="2" w:tentative="1">
+      <w:start w:val="1"/>
+      <w:numFmt w:val="bullet"/>
+      <w:lvlText w:val=""/>
+      <w:lvlJc w:val="left"/>
+      <w:pPr>
+        <w:tabs>
+          <w:tab w:val="num" w:pos="2160"/>
+        </w:tabs>
+        <w:ind w:left="2160" w:hanging="360"/>
+      </w:pPr>
+      <w:rPr>
+        <w:rFonts w:ascii="Wingdings" w:hAnsi="Wingdings" w:hint="default"/>
+        <w:sz w:val="20"/>
+      </w:rPr>
+    </w:lvl>
+    <w:lvl w:ilvl="3" w:tentative="1">
+      <w:start w:val="1"/>
+      <w:numFmt w:val="bullet"/>
+      <w:lvlText w:val=""/>
+      <w:lvlJc w:val="left"/>
+      <w:pPr>
+        <w:tabs>
+          <w:tab w:val="num" w:pos="2880"/>
+        </w:tabs>
+        <w:ind w:left="2880" w:hanging="360"/>
+      </w:pPr>
+      <w:rPr>
+        <w:rFonts w:ascii="Wingdings" w:hAnsi="Wingdings" w:hint="default"/>
+        <w:sz w:val="20"/>
+      </w:rPr>
+    </w:lvl>
+    <w:lvl w:ilvl="4" w:tentative="1">
+      <w:start w:val="1"/>
+      <w:numFmt w:val="bullet"/>
+      <w:lvlText w:val=""/>
+      <w:lvlJc w:val="left"/>
+      <w:pPr>
+        <w:tabs>
+          <w:tab w:val="num" w:pos="3600"/>
+        </w:tabs>
+        <w:ind w:left="3600" w:hanging="360"/>
+      </w:pPr>
+      <w:rPr>
+        <w:rFonts w:ascii="Wingdings" w:hAnsi="Wingdings" w:hint="default"/>
+        <w:sz w:val="20"/>
+      </w:rPr>
+    </w:lvl>
+    <w:lvl w:ilvl="5" w:tentative="1">
+      <w:start w:val="1"/>
+      <w:numFmt w:val="bullet"/>
+      <w:lvlText w:val=""/>
+      <w:lvlJc w:val="left"/>
+      <w:pPr>
+        <w:tabs>
+          <w:tab w:val="num" w:pos="4320"/>
+        </w:tabs>
+        <w:ind w:left="4320" w:hanging="360"/>
+      </w:pPr>
+      <w:rPr>
+        <w:rFonts w:ascii="Wingdings" w:hAnsi="Wingdings" w:hint="default"/>
+        <w:sz w:val="20"/>
+      </w:rPr>
+    </w:lvl>
+    <w:lvl w:ilvl="6" w:tentative="1">
+      <w:start w:val="1"/>
+      <w:numFmt w:val="bullet"/>
+      <w:lvlText w:val=""/>
+      <w:lvlJc w:val="left"/>
+      <w:pPr>
+        <w:tabs>
+          <w:tab w:val="num" w:pos="5040"/>
+        </w:tabs>
+        <w:ind w:left="5040" w:hanging="360"/>
+      </w:pPr>
+      <w:rPr>
+        <w:rFonts w:ascii="Wingdings" w:hAnsi="Wingdings" w:hint="default"/>
+        <w:sz w:val="20"/>
+      </w:rPr>
+    </w:lvl>
+    <w:lvl w:ilvl="7" w:tentative="1">
+      <w:start w:val="1"/>
+      <w:numFmt w:val="bullet"/>
+      <w:lvlText w:val=""/>
+      <w:lvlJc w:val="left"/>
+      <w:pPr>
+        <w:tabs>
+          <w:tab w:val="num" w:pos="5760"/>
+        </w:tabs>
+        <w:ind w:left="5760" w:hanging="360"/>
+      </w:pPr>
+      <w:rPr>
+        <w:rFonts w:ascii="Wingdings" w:hAnsi="Wingdings" w:hint="default"/>
+        <w:sz w:val="20"/>
+      </w:rPr>
+    </w:lvl>
+    <w:lvl w:ilvl="8" w:tentative="1">
+      <w:start w:val="1"/>
+      <w:numFmt w:val="bullet"/>
+      <w:lvlText w:val=""/>
+      <w:lvlJc w:val="left"/>
+      <w:pPr>
+        <w:tabs>
+          <w:tab w:val="num" w:pos="6480"/>
+        </w:tabs>
+        <w:ind w:left="6480" w:hanging="360"/>
+      </w:pPr>
+      <w:rPr>
+        <w:rFonts w:ascii="Wingdings" w:hAnsi="Wingdings" w:hint="default"/>
+        <w:sz w:val="20"/>
+      </w:rPr>
+    </w:lvl>
+  </w:abstractNum>
+  <w:abstractNum w:abstractNumId="21" w15:restartNumberingAfterBreak="0">
     <w:nsid w:val="4E182656"/>
     <w:multiLevelType w:val="multilevel"/>
     <w:tmpl w:val="BE323BC2"/>
@@ -3847,7 +6874,7 @@
       </w:pPr>
     </w:lvl>
   </w:abstractNum>
-  <w:abstractNum w:abstractNumId="14" w15:restartNumberingAfterBreak="0">
+  <w:abstractNum w:abstractNumId="22" w15:restartNumberingAfterBreak="0">
     <w:nsid w:val="4F9C6821"/>
     <w:multiLevelType w:val="multilevel"/>
     <w:tmpl w:val="F4EA641A"/>
@@ -3996,7 +7023,7 @@
       </w:rPr>
     </w:lvl>
   </w:abstractNum>
-  <w:abstractNum w:abstractNumId="15" w15:restartNumberingAfterBreak="0">
+  <w:abstractNum w:abstractNumId="23" w15:restartNumberingAfterBreak="0">
     <w:nsid w:val="53426126"/>
     <w:multiLevelType w:val="multilevel"/>
     <w:tmpl w:val="6BE214FA"/>
@@ -4145,7 +7172,7 @@
       </w:rPr>
     </w:lvl>
   </w:abstractNum>
-  <w:abstractNum w:abstractNumId="16" w15:restartNumberingAfterBreak="0">
+  <w:abstractNum w:abstractNumId="24" w15:restartNumberingAfterBreak="0">
     <w:nsid w:val="555F74FE"/>
     <w:multiLevelType w:val="multilevel"/>
     <w:tmpl w:val="0CAA57D6"/>
@@ -4294,7 +7321,156 @@
       </w:rPr>
     </w:lvl>
   </w:abstractNum>
-  <w:abstractNum w:abstractNumId="17" w15:restartNumberingAfterBreak="0">
+  <w:abstractNum w:abstractNumId="25" w15:restartNumberingAfterBreak="0">
+    <w:nsid w:val="5775644E"/>
+    <w:multiLevelType w:val="multilevel"/>
+    <w:tmpl w:val="887EB47A"/>
+    <w:lvl w:ilvl="0">
+      <w:start w:val="1"/>
+      <w:numFmt w:val="bullet"/>
+      <w:lvlText w:val=""/>
+      <w:lvlJc w:val="left"/>
+      <w:pPr>
+        <w:tabs>
+          <w:tab w:val="num" w:pos="720"/>
+        </w:tabs>
+        <w:ind w:left="720" w:hanging="360"/>
+      </w:pPr>
+      <w:rPr>
+        <w:rFonts w:ascii="Symbol" w:hAnsi="Symbol" w:hint="default"/>
+        <w:sz w:val="20"/>
+      </w:rPr>
+    </w:lvl>
+    <w:lvl w:ilvl="1" w:tentative="1">
+      <w:start w:val="1"/>
+      <w:numFmt w:val="bullet"/>
+      <w:lvlText w:val="o"/>
+      <w:lvlJc w:val="left"/>
+      <w:pPr>
+        <w:tabs>
+          <w:tab w:val="num" w:pos="1440"/>
+        </w:tabs>
+        <w:ind w:left="1440" w:hanging="360"/>
+      </w:pPr>
+      <w:rPr>
+        <w:rFonts w:ascii="Courier New" w:hAnsi="Courier New" w:hint="default"/>
+        <w:sz w:val="20"/>
+      </w:rPr>
+    </w:lvl>
+    <w:lvl w:ilvl="2" w:tentative="1">
+      <w:start w:val="1"/>
+      <w:numFmt w:val="bullet"/>
+      <w:lvlText w:val=""/>
+      <w:lvlJc w:val="left"/>
+      <w:pPr>
+        <w:tabs>
+          <w:tab w:val="num" w:pos="2160"/>
+        </w:tabs>
+        <w:ind w:left="2160" w:hanging="360"/>
+      </w:pPr>
+      <w:rPr>
+        <w:rFonts w:ascii="Wingdings" w:hAnsi="Wingdings" w:hint="default"/>
+        <w:sz w:val="20"/>
+      </w:rPr>
+    </w:lvl>
+    <w:lvl w:ilvl="3" w:tentative="1">
+      <w:start w:val="1"/>
+      <w:numFmt w:val="bullet"/>
+      <w:lvlText w:val=""/>
+      <w:lvlJc w:val="left"/>
+      <w:pPr>
+        <w:tabs>
+          <w:tab w:val="num" w:pos="2880"/>
+        </w:tabs>
+        <w:ind w:left="2880" w:hanging="360"/>
+      </w:pPr>
+      <w:rPr>
+        <w:rFonts w:ascii="Wingdings" w:hAnsi="Wingdings" w:hint="default"/>
+        <w:sz w:val="20"/>
+      </w:rPr>
+    </w:lvl>
+    <w:lvl w:ilvl="4" w:tentative="1">
+      <w:start w:val="1"/>
+      <w:numFmt w:val="bullet"/>
+      <w:lvlText w:val=""/>
+      <w:lvlJc w:val="left"/>
+      <w:pPr>
+        <w:tabs>
+          <w:tab w:val="num" w:pos="3600"/>
+        </w:tabs>
+        <w:ind w:left="3600" w:hanging="360"/>
+      </w:pPr>
+      <w:rPr>
+        <w:rFonts w:ascii="Wingdings" w:hAnsi="Wingdings" w:hint="default"/>
+        <w:sz w:val="20"/>
+      </w:rPr>
+    </w:lvl>
+    <w:lvl w:ilvl="5" w:tentative="1">
+      <w:start w:val="1"/>
+      <w:numFmt w:val="bullet"/>
+      <w:lvlText w:val=""/>
+      <w:lvlJc w:val="left"/>
+      <w:pPr>
+        <w:tabs>
+          <w:tab w:val="num" w:pos="4320"/>
+        </w:tabs>
+        <w:ind w:left="4320" w:hanging="360"/>
+      </w:pPr>
+      <w:rPr>
+        <w:rFonts w:ascii="Wingdings" w:hAnsi="Wingdings" w:hint="default"/>
+        <w:sz w:val="20"/>
+      </w:rPr>
+    </w:lvl>
+    <w:lvl w:ilvl="6" w:tentative="1">
+      <w:start w:val="1"/>
+      <w:numFmt w:val="bullet"/>
+      <w:lvlText w:val=""/>
+      <w:lvlJc w:val="left"/>
+      <w:pPr>
+        <w:tabs>
+          <w:tab w:val="num" w:pos="5040"/>
+        </w:tabs>
+        <w:ind w:left="5040" w:hanging="360"/>
+      </w:pPr>
+      <w:rPr>
+        <w:rFonts w:ascii="Wingdings" w:hAnsi="Wingdings" w:hint="default"/>
+        <w:sz w:val="20"/>
+      </w:rPr>
+    </w:lvl>
+    <w:lvl w:ilvl="7" w:tentative="1">
+      <w:start w:val="1"/>
+      <w:numFmt w:val="bullet"/>
+      <w:lvlText w:val=""/>
+      <w:lvlJc w:val="left"/>
+      <w:pPr>
+        <w:tabs>
+          <w:tab w:val="num" w:pos="5760"/>
+        </w:tabs>
+        <w:ind w:left="5760" w:hanging="360"/>
+      </w:pPr>
+      <w:rPr>
+        <w:rFonts w:ascii="Wingdings" w:hAnsi="Wingdings" w:hint="default"/>
+        <w:sz w:val="20"/>
+      </w:rPr>
+    </w:lvl>
+    <w:lvl w:ilvl="8" w:tentative="1">
+      <w:start w:val="1"/>
+      <w:numFmt w:val="bullet"/>
+      <w:lvlText w:val=""/>
+      <w:lvlJc w:val="left"/>
+      <w:pPr>
+        <w:tabs>
+          <w:tab w:val="num" w:pos="6480"/>
+        </w:tabs>
+        <w:ind w:left="6480" w:hanging="360"/>
+      </w:pPr>
+      <w:rPr>
+        <w:rFonts w:ascii="Wingdings" w:hAnsi="Wingdings" w:hint="default"/>
+        <w:sz w:val="20"/>
+      </w:rPr>
+    </w:lvl>
+  </w:abstractNum>
+  <w:abstractNum w:abstractNumId="26" w15:restartNumberingAfterBreak="0">
     <w:nsid w:val="58B67865"/>
     <w:multiLevelType w:val="multilevel"/>
     <w:tmpl w:val="2DFCA4C6"/>
@@ -4443,7 +7619,7 @@
       </w:rPr>
     </w:lvl>
   </w:abstractNum>
-  <w:abstractNum w:abstractNumId="18" w15:restartNumberingAfterBreak="0">
+  <w:abstractNum w:abstractNumId="27" w15:restartNumberingAfterBreak="0">
     <w:nsid w:val="612043CD"/>
     <w:multiLevelType w:val="multilevel"/>
     <w:tmpl w:val="B066E9B0"/>
@@ -4592,7 +7768,7 @@
       </w:rPr>
     </w:lvl>
   </w:abstractNum>
-  <w:abstractNum w:abstractNumId="19" w15:restartNumberingAfterBreak="0">
+  <w:abstractNum w:abstractNumId="28" w15:restartNumberingAfterBreak="0">
     <w:nsid w:val="62064BFA"/>
     <w:multiLevelType w:val="multilevel"/>
     <w:tmpl w:val="E5BACDE8"/>
@@ -4741,7 +7917,7 @@
       </w:rPr>
     </w:lvl>
   </w:abstractNum>
-  <w:abstractNum w:abstractNumId="20" w15:restartNumberingAfterBreak="0">
+  <w:abstractNum w:abstractNumId="29" w15:restartNumberingAfterBreak="0">
     <w:nsid w:val="652F1718"/>
     <w:multiLevelType w:val="multilevel"/>
     <w:tmpl w:val="6A92C79A"/>
@@ -4890,7 +8066,7 @@
       </w:rPr>
     </w:lvl>
   </w:abstractNum>
-  <w:abstractNum w:abstractNumId="21" w15:restartNumberingAfterBreak="0">
+  <w:abstractNum w:abstractNumId="30" w15:restartNumberingAfterBreak="0">
     <w:nsid w:val="6EE34C35"/>
     <w:multiLevelType w:val="multilevel"/>
     <w:tmpl w:val="9E26AA9A"/>
@@ -5039,7 +8215,7 @@
       </w:rPr>
     </w:lvl>
   </w:abstractNum>
-  <w:abstractNum w:abstractNumId="22" w15:restartNumberingAfterBreak="0">
+  <w:abstractNum w:abstractNumId="31" w15:restartNumberingAfterBreak="0">
     <w:nsid w:val="710651CC"/>
     <w:multiLevelType w:val="multilevel"/>
     <w:tmpl w:val="67302354"/>
@@ -5188,7 +8364,7 @@
       </w:rPr>
     </w:lvl>
   </w:abstractNum>
-  <w:abstractNum w:abstractNumId="23" w15:restartNumberingAfterBreak="0">
+  <w:abstractNum w:abstractNumId="32" w15:restartNumberingAfterBreak="0">
     <w:nsid w:val="71A0500A"/>
     <w:multiLevelType w:val="multilevel"/>
     <w:tmpl w:val="93E681A4"/>
@@ -5337,7 +8513,7 @@
       </w:rPr>
     </w:lvl>
   </w:abstractNum>
-  <w:abstractNum w:abstractNumId="24" w15:restartNumberingAfterBreak="0">
+  <w:abstractNum w:abstractNumId="33" w15:restartNumberingAfterBreak="0">
     <w:nsid w:val="71AB77C6"/>
     <w:multiLevelType w:val="multilevel"/>
     <w:tmpl w:val="4D7AA5E2"/>
@@ -5486,7 +8662,7 @@
       </w:rPr>
     </w:lvl>
   </w:abstractNum>
-  <w:abstractNum w:abstractNumId="25" w15:restartNumberingAfterBreak="0">
+  <w:abstractNum w:abstractNumId="34" w15:restartNumberingAfterBreak="0">
     <w:nsid w:val="75825D20"/>
     <w:multiLevelType w:val="multilevel"/>
     <w:tmpl w:val="DFDC96B0"/>
@@ -5635,83 +8811,262 @@
       </w:rPr>
     </w:lvl>
   </w:abstractNum>
+  <w:abstractNum w:abstractNumId="35" w15:restartNumberingAfterBreak="0">
+    <w:nsid w:val="7E654141"/>
+    <w:multiLevelType w:val="multilevel"/>
+    <w:tmpl w:val="26E0EDBE"/>
+    <w:lvl w:ilvl="0">
+      <w:start w:val="1"/>
+      <w:numFmt w:val="bullet"/>
+      <w:lvlText w:val=""/>
+      <w:lvlJc w:val="left"/>
+      <w:pPr>
+        <w:tabs>
+          <w:tab w:val="num" w:pos="720"/>
+        </w:tabs>
+        <w:ind w:left="720" w:hanging="360"/>
+      </w:pPr>
+      <w:rPr>
+        <w:rFonts w:ascii="Symbol" w:hAnsi="Symbol" w:hint="default"/>
+        <w:sz w:val="20"/>
+      </w:rPr>
+    </w:lvl>
+    <w:lvl w:ilvl="1">
+      <w:start w:val="1"/>
+      <w:numFmt w:val="bullet"/>
+      <w:lvlText w:val="o"/>
+      <w:lvlJc w:val="left"/>
+      <w:pPr>
+        <w:tabs>
+          <w:tab w:val="num" w:pos="1440"/>
+        </w:tabs>
+        <w:ind w:left="1440" w:hanging="360"/>
+      </w:pPr>
+      <w:rPr>
+        <w:rFonts w:ascii="Courier New" w:hAnsi="Courier New" w:hint="default"/>
+        <w:sz w:val="20"/>
+      </w:rPr>
+    </w:lvl>
+    <w:lvl w:ilvl="2" w:tentative="1">
+      <w:start w:val="1"/>
+      <w:numFmt w:val="bullet"/>
+      <w:lvlText w:val=""/>
+      <w:lvlJc w:val="left"/>
+      <w:pPr>
+        <w:tabs>
+          <w:tab w:val="num" w:pos="2160"/>
+        </w:tabs>
+        <w:ind w:left="2160" w:hanging="360"/>
+      </w:pPr>
+      <w:rPr>
+        <w:rFonts w:ascii="Wingdings" w:hAnsi="Wingdings" w:hint="default"/>
+        <w:sz w:val="20"/>
+      </w:rPr>
+    </w:lvl>
+    <w:lvl w:ilvl="3" w:tentative="1">
+      <w:start w:val="1"/>
+      <w:numFmt w:val="bullet"/>
+      <w:lvlText w:val=""/>
+      <w:lvlJc w:val="left"/>
+      <w:pPr>
+        <w:tabs>
+          <w:tab w:val="num" w:pos="2880"/>
+        </w:tabs>
+        <w:ind w:left="2880" w:hanging="360"/>
+      </w:pPr>
+      <w:rPr>
+        <w:rFonts w:ascii="Wingdings" w:hAnsi="Wingdings" w:hint="default"/>
+        <w:sz w:val="20"/>
+      </w:rPr>
+    </w:lvl>
+    <w:lvl w:ilvl="4" w:tentative="1">
+      <w:start w:val="1"/>
+      <w:numFmt w:val="bullet"/>
+      <w:lvlText w:val=""/>
+      <w:lvlJc w:val="left"/>
+      <w:pPr>
+        <w:tabs>
+          <w:tab w:val="num" w:pos="3600"/>
+        </w:tabs>
+        <w:ind w:left="3600" w:hanging="360"/>
+      </w:pPr>
+      <w:rPr>
+        <w:rFonts w:ascii="Wingdings" w:hAnsi="Wingdings" w:hint="default"/>
+        <w:sz w:val="20"/>
+      </w:rPr>
+    </w:lvl>
+    <w:lvl w:ilvl="5" w:tentative="1">
+      <w:start w:val="1"/>
+      <w:numFmt w:val="bullet"/>
+      <w:lvlText w:val=""/>
+      <w:lvlJc w:val="left"/>
+      <w:pPr>
+        <w:tabs>
+          <w:tab w:val="num" w:pos="4320"/>
+        </w:tabs>
+        <w:ind w:left="4320" w:hanging="360"/>
+      </w:pPr>
+      <w:rPr>
+        <w:rFonts w:ascii="Wingdings" w:hAnsi="Wingdings" w:hint="default"/>
+        <w:sz w:val="20"/>
+      </w:rPr>
+    </w:lvl>
+    <w:lvl w:ilvl="6" w:tentative="1">
+      <w:start w:val="1"/>
+      <w:numFmt w:val="bullet"/>
+      <w:lvlText w:val=""/>
+      <w:lvlJc w:val="left"/>
+      <w:pPr>
+        <w:tabs>
+          <w:tab w:val="num" w:pos="5040"/>
+        </w:tabs>
+        <w:ind w:left="5040" w:hanging="360"/>
+      </w:pPr>
+      <w:rPr>
+        <w:rFonts w:ascii="Wingdings" w:hAnsi="Wingdings" w:hint="default"/>
+        <w:sz w:val="20"/>
+      </w:rPr>
+    </w:lvl>
+    <w:lvl w:ilvl="7" w:tentative="1">
+      <w:start w:val="1"/>
+      <w:numFmt w:val="bullet"/>
+      <w:lvlText w:val=""/>
+      <w:lvlJc w:val="left"/>
+      <w:pPr>
+        <w:tabs>
+          <w:tab w:val="num" w:pos="5760"/>
+        </w:tabs>
+        <w:ind w:left="5760" w:hanging="360"/>
+      </w:pPr>
+      <w:rPr>
+        <w:rFonts w:ascii="Wingdings" w:hAnsi="Wingdings" w:hint="default"/>
+        <w:sz w:val="20"/>
+      </w:rPr>
+    </w:lvl>
+    <w:lvl w:ilvl="8" w:tentative="1">
+      <w:start w:val="1"/>
+      <w:numFmt w:val="bullet"/>
+      <w:lvlText w:val=""/>
+      <w:lvlJc w:val="left"/>
+      <w:pPr>
+        <w:tabs>
+          <w:tab w:val="num" w:pos="6480"/>
+        </w:tabs>
+        <w:ind w:left="6480" w:hanging="360"/>
+      </w:pPr>
+      <w:rPr>
+        <w:rFonts w:ascii="Wingdings" w:hAnsi="Wingdings" w:hint="default"/>
+        <w:sz w:val="20"/>
+      </w:rPr>
+    </w:lvl>
+  </w:abstractNum>
   <w:num w:numId="1">
+    <w:abstractNumId w:val="12"/>
+  </w:num>
+  <w:num w:numId="2">
+    <w:abstractNumId w:val="30"/>
+  </w:num>
+  <w:num w:numId="3">
+    <w:abstractNumId w:val="15"/>
+  </w:num>
+  <w:num w:numId="4">
     <w:abstractNumId w:val="7"/>
   </w:num>
-  <w:num w:numId="2">
-    <w:abstractNumId w:val="21"/>
-  </w:num>
-  <w:num w:numId="3">
-    <w:abstractNumId w:val="9"/>
-  </w:num>
-  <w:num w:numId="4">
-    <w:abstractNumId w:val="4"/>
-  </w:num>
   <w:num w:numId="5">
-    <w:abstractNumId w:val="23"/>
+    <w:abstractNumId w:val="32"/>
   </w:num>
   <w:num w:numId="6">
     <w:abstractNumId w:val="1"/>
   </w:num>
   <w:num w:numId="7">
-    <w:abstractNumId w:val="15"/>
+    <w:abstractNumId w:val="23"/>
   </w:num>
   <w:num w:numId="8">
-    <w:abstractNumId w:val="3"/>
+    <w:abstractNumId w:val="4"/>
   </w:num>
   <w:num w:numId="9">
-    <w:abstractNumId w:val="11"/>
+    <w:abstractNumId w:val="17"/>
   </w:num>
   <w:num w:numId="10">
-    <w:abstractNumId w:val="14"/>
+    <w:abstractNumId w:val="22"/>
   </w:num>
   <w:num w:numId="11">
-    <w:abstractNumId w:val="13"/>
+    <w:abstractNumId w:val="21"/>
   </w:num>
   <w:num w:numId="12">
     <w:abstractNumId w:val="0"/>
   </w:num>
   <w:num w:numId="13">
+    <w:abstractNumId w:val="9"/>
+  </w:num>
+  <w:num w:numId="14">
+    <w:abstractNumId w:val="34"/>
+  </w:num>
+  <w:num w:numId="15">
+    <w:abstractNumId w:val="16"/>
+  </w:num>
+  <w:num w:numId="16">
+    <w:abstractNumId w:val="29"/>
+  </w:num>
+  <w:num w:numId="17">
+    <w:abstractNumId w:val="31"/>
+  </w:num>
+  <w:num w:numId="18">
+    <w:abstractNumId w:val="28"/>
+  </w:num>
+  <w:num w:numId="19">
+    <w:abstractNumId w:val="33"/>
+  </w:num>
+  <w:num w:numId="20">
+    <w:abstractNumId w:val="13"/>
+  </w:num>
+  <w:num w:numId="21">
+    <w:abstractNumId w:val="24"/>
+  </w:num>
+  <w:num w:numId="22">
+    <w:abstractNumId w:val="8"/>
+  </w:num>
+  <w:num w:numId="23">
+    <w:abstractNumId w:val="18"/>
+  </w:num>
+  <w:num w:numId="24">
+    <w:abstractNumId w:val="3"/>
+  </w:num>
+  <w:num w:numId="25">
+    <w:abstractNumId w:val="27"/>
+  </w:num>
+  <w:num w:numId="26">
+    <w:abstractNumId w:val="26"/>
+  </w:num>
+  <w:num w:numId="27">
+    <w:abstractNumId w:val="14"/>
+  </w:num>
+  <w:num w:numId="28">
+    <w:abstractNumId w:val="35"/>
+  </w:num>
+  <w:num w:numId="29">
+    <w:abstractNumId w:val="2"/>
+  </w:num>
+  <w:num w:numId="30">
+    <w:abstractNumId w:val="10"/>
+  </w:num>
+  <w:num w:numId="31">
     <w:abstractNumId w:val="6"/>
   </w:num>
-  <w:num w:numId="14">
+  <w:num w:numId="32">
     <w:abstractNumId w:val="25"/>
   </w:num>
-  <w:num w:numId="15">
-    <w:abstractNumId w:val="10"/>
+  <w:num w:numId="33">
+    <w:abstractNumId w:val="11"/>
   </w:num>
-  <w:num w:numId="16">
+  <w:num w:numId="34">
     <w:abstractNumId w:val="20"/>
   </w:num>
-  <w:num w:numId="17">
-    <w:abstractNumId w:val="22"/>
-  </w:num>
-  <w:num w:numId="18">
-    <w:abstractNumId w:val="19"/>
-  </w:num>
-  <w:num w:numId="19">
-    <w:abstractNumId w:val="24"/>
-  </w:num>
-  <w:num w:numId="20">
-    <w:abstractNumId w:val="8"/>
-  </w:num>
-  <w:num w:numId="21">
-    <w:abstractNumId w:val="16"/>
-  </w:num>
-  <w:num w:numId="22">
+  <w:num w:numId="35">
     <w:abstractNumId w:val="5"/>
   </w:num>
-  <w:num w:numId="23">
-    <w:abstractNumId w:val="12"/>
-  </w:num>
-  <w:num w:numId="24">
-    <w:abstractNumId w:val="2"/>
-  </w:num>
-  <w:num w:numId="25">
-    <w:abstractNumId w:val="18"/>
-  </w:num>
-  <w:num w:numId="26">
-    <w:abstractNumId w:val="17"/>
+  <w:num w:numId="36">
+    <w:abstractNumId w:val="19"/>
   </w:num>
   <w:numIdMacAtCleanup w:val="13"/>
 </w:numbering>
@@ -6169,6 +9524,29 @@
       <w:szCs w:val="27"/>
     </w:rPr>
   </w:style>
+  <w:style w:type="paragraph" w:styleId="Heading4">
+    <w:name w:val="heading 4"/>
+    <w:basedOn w:val="Normal"/>
+    <w:next w:val="Normal"/>
+    <w:link w:val="Heading4Char"/>
+    <w:uiPriority w:val="9"/>
+    <w:semiHidden/>
+    <w:unhideWhenUsed/>
+    <w:qFormat/>
+    <w:rsid w:val="00CF6AF6"/>
+    <w:pPr>
+      <w:keepNext/>
+      <w:keepLines/>
+      <w:spacing w:before="40" w:after="0"/>
+      <w:outlineLvl w:val="3"/>
+    </w:pPr>
+    <w:rPr>
+      <w:rFonts w:asciiTheme="majorHAnsi" w:eastAsiaTheme="majorEastAsia" w:hAnsiTheme="majorHAnsi" w:cstheme="majorBidi"/>
+      <w:i/>
+      <w:iCs/>
+      <w:color w:val="2F5496" w:themeColor="accent1" w:themeShade="BF"/>
+    </w:rPr>
+  </w:style>
   <w:style w:type="character" w:default="1" w:styleId="DefaultParagraphFont">
     <w:name w:val="Default Paragraph Font"/>
     <w:uiPriority w:val="1"/>
@@ -6243,7 +9621,6 @@
     <w:name w:val="Normal (Web)"/>
     <w:basedOn w:val="Normal"/>
     <w:uiPriority w:val="99"/>
-    <w:semiHidden/>
     <w:unhideWhenUsed/>
     <w:rsid w:val="00375FFA"/>
     <w:pPr>
@@ -6288,6 +9665,20 @@
       <w:rFonts w:ascii="Courier New" w:eastAsia="Times New Roman" w:hAnsi="Courier New" w:cs="Courier New"/>
       <w:sz w:val="20"/>
       <w:szCs w:val="20"/>
+    </w:rPr>
+  </w:style>
+  <w:style w:type="character" w:customStyle="1" w:styleId="Heading4Char">
+    <w:name w:val="Heading 4 Char"/>
+    <w:basedOn w:val="DefaultParagraphFont"/>
+    <w:link w:val="Heading4"/>
+    <w:uiPriority w:val="9"/>
+    <w:semiHidden/>
+    <w:rsid w:val="00CF6AF6"/>
+    <w:rPr>
+      <w:rFonts w:asciiTheme="majorHAnsi" w:eastAsiaTheme="majorEastAsia" w:hAnsiTheme="majorHAnsi" w:cstheme="majorBidi"/>
+      <w:i/>
+      <w:iCs/>
+      <w:color w:val="2F5496" w:themeColor="accent1" w:themeShade="BF"/>
     </w:rPr>
   </w:style>
 </w:styles>

</xml_diff>